<commit_message>
Revise simulation for Aim 1
</commit_message>
<xml_diff>
--- a/writing/ror-modeling-strategy.docx
+++ b/writing/ror-modeling-strategy.docx
@@ -31,7 +31,7 @@
         <w:pStyle w:val="Date"/>
       </w:pPr>
       <w:r>
-        <w:t xml:space="preserve">2026-08-12</w:t>
+        <w:t xml:space="preserve">2026-08-13</w:t>
       </w:r>
     </w:p>
     <w:bookmarkStart w:id="20" w:name="purpose-of-this-document"/>
@@ -491,6 +491,432 @@
         <w:t xml:space="preserve">Primary outcome: modeling the difference, not the level</w:t>
       </w:r>
     </w:p>
+    <w:p>
+      <w:pPr>
+        <w:pStyle w:val="FirstParagraph"/>
+      </w:pPr>
+      <w:r>
+        <w:t xml:space="preserve">The primary Aim 1 outlined above is to assess how</w:t>
+      </w:r>
+      <w:r>
+        <w:t xml:space="preserve"> </w:t>
+      </w:r>
+      <w:r>
+        <w:rPr>
+          <w:i/>
+          <w:iCs/>
+        </w:rPr>
+        <w:t xml:space="preserve">changes</w:t>
+      </w:r>
+      <w:r>
+        <w:t xml:space="preserve"> </w:t>
+      </w:r>
+      <w:r>
+        <w:t xml:space="preserve">from the initial consensus score to the final review scores (after discussion) may vary with panel expertise and engagement. Thus, rather than our primary outcome being the overall application score, we specifically want to model the difference between the consensus score and the final scores.</w:t>
+      </w:r>
+    </w:p>
+    <w:p>
+      <w:pPr>
+        <w:pStyle w:val="BodyText"/>
+      </w:pPr>
+      <w:r>
+        <w:t xml:space="preserve">Let</w:t>
+      </w:r>
+      <w:r>
+        <w:t xml:space="preserve"> </w:t>
+      </w:r>
+      <m:oMath>
+        <m:sSub>
+          <m:e>
+            <m:r>
+              <m:t>d</m:t>
+            </m:r>
+          </m:e>
+          <m:sub>
+            <m:r>
+              <m:t>i</m:t>
+            </m:r>
+            <m:r>
+              <m:t>j</m:t>
+            </m:r>
+            <m:r>
+              <m:t>k</m:t>
+            </m:r>
+          </m:sub>
+        </m:sSub>
+      </m:oMath>
+      <w:r>
+        <w:t xml:space="preserve"> </w:t>
+      </w:r>
+      <w:r>
+        <w:t xml:space="preserve">be the final score minus the consensus score, for the</w:t>
+      </w:r>
+      <w:r>
+        <w:t xml:space="preserve"> </w:t>
+      </w:r>
+      <m:oMath>
+        <m:r>
+          <m:t>i</m:t>
+        </m:r>
+      </m:oMath>
+      <w:r>
+        <w:t xml:space="preserve">th panel member on the</w:t>
+      </w:r>
+      <w:r>
+        <w:t xml:space="preserve"> </w:t>
+      </w:r>
+      <m:oMath>
+        <m:r>
+          <m:t>j</m:t>
+        </m:r>
+      </m:oMath>
+      <w:r>
+        <w:t xml:space="preserve">th application in the</w:t>
+      </w:r>
+      <w:r>
+        <w:t xml:space="preserve"> </w:t>
+      </w:r>
+      <m:oMath>
+        <m:r>
+          <m:t>k</m:t>
+        </m:r>
+      </m:oMath>
+      <w:r>
+        <w:t xml:space="preserve">th committee:</w:t>
+      </w:r>
+    </w:p>
+    <w:p>
+      <w:pPr>
+        <w:pStyle w:val="BodyText"/>
+      </w:pPr>
+      <m:oMathPara>
+        <m:oMathParaPr>
+          <m:jc m:val="center"/>
+        </m:oMathParaPr>
+        <m:oMath>
+          <m:sSub>
+            <m:e>
+              <m:r>
+                <m:t>d</m:t>
+              </m:r>
+            </m:e>
+            <m:sub>
+              <m:r>
+                <m:t>i</m:t>
+              </m:r>
+              <m:r>
+                <m:t>j</m:t>
+              </m:r>
+              <m:r>
+                <m:t>k</m:t>
+              </m:r>
+            </m:sub>
+          </m:sSub>
+          <m:r>
+            <m:rPr>
+              <m:sty m:val="p"/>
+            </m:rPr>
+            <m:t>=</m:t>
+          </m:r>
+          <m:sSub>
+            <m:e>
+              <m:r>
+                <m:rPr>
+                  <m:nor/>
+                  <m:sty m:val="p"/>
+                </m:rPr>
+                <m:t>final score</m:t>
+              </m:r>
+            </m:e>
+            <m:sub>
+              <m:r>
+                <m:t>i</m:t>
+              </m:r>
+              <m:r>
+                <m:t>j</m:t>
+              </m:r>
+              <m:r>
+                <m:t>k</m:t>
+              </m:r>
+            </m:sub>
+          </m:sSub>
+          <m:r>
+            <m:rPr>
+              <m:sty m:val="p"/>
+            </m:rPr>
+            <m:t>−</m:t>
+          </m:r>
+          <m:sSub>
+            <m:e>
+              <m:r>
+                <m:rPr>
+                  <m:nor/>
+                  <m:sty m:val="p"/>
+                </m:rPr>
+                <m:t>consensus score</m:t>
+              </m:r>
+            </m:e>
+            <m:sub>
+              <m:r>
+                <m:t>j</m:t>
+              </m:r>
+              <m:r>
+                <m:t>k</m:t>
+              </m:r>
+            </m:sub>
+          </m:sSub>
+        </m:oMath>
+      </m:oMathPara>
+    </w:p>
+    <w:p>
+      <w:pPr>
+        <w:pStyle w:val="FirstParagraph"/>
+      </w:pPr>
+      <w:r>
+        <w:t xml:space="preserve">Our interest is in modeling</w:t>
+      </w:r>
+      <w:r>
+        <w:t xml:space="preserve"> </w:t>
+      </w:r>
+      <m:oMath>
+        <m:sSub>
+          <m:e>
+            <m:r>
+              <m:t>d</m:t>
+            </m:r>
+          </m:e>
+          <m:sub>
+            <m:r>
+              <m:t>i</m:t>
+            </m:r>
+            <m:r>
+              <m:t>j</m:t>
+            </m:r>
+            <m:r>
+              <m:t>k</m:t>
+            </m:r>
+          </m:sub>
+        </m:sSub>
+      </m:oMath>
+      <w:r>
+        <w:t xml:space="preserve"> </w:t>
+      </w:r>
+      <w:r>
+        <w:t xml:space="preserve">directly, rather than modeling the final score with consensus score as a covariate, for three reasons:</w:t>
+      </w:r>
+    </w:p>
+    <w:p>
+      <w:pPr>
+        <w:pStyle w:val="Compact"/>
+        <w:numPr>
+          <w:ilvl w:val="0"/>
+          <w:numId w:val="1003"/>
+        </w:numPr>
+      </w:pPr>
+      <w:r>
+        <w:rPr>
+          <w:b/>
+          <w:bCs/>
+        </w:rPr>
+        <w:t xml:space="preserve">Point mass at zero.</w:t>
+      </w:r>
+      <w:r>
+        <w:t xml:space="preserve"> </w:t>
+      </w:r>
+      <w:r>
+        <w:t xml:space="preserve">We hypothesize that most or many members will go with the consensus score, which leads to a mass either at the consensus (if you modeled the score) or a mass at zero if you model the difference. A member who doesn’t move from consensus has</w:t>
+      </w:r>
+      <w:r>
+        <w:t xml:space="preserve"> </w:t>
+      </w:r>
+      <m:oMath>
+        <m:sSub>
+          <m:e>
+            <m:r>
+              <m:t>d</m:t>
+            </m:r>
+          </m:e>
+          <m:sub>
+            <m:r>
+              <m:t>i</m:t>
+            </m:r>
+            <m:r>
+              <m:t>j</m:t>
+            </m:r>
+            <m:r>
+              <m:t>k</m:t>
+            </m:r>
+          </m:sub>
+        </m:sSub>
+        <m:r>
+          <m:rPr>
+            <m:sty m:val="p"/>
+          </m:rPr>
+          <m:t>=</m:t>
+        </m:r>
+        <m:r>
+          <m:t>0</m:t>
+        </m:r>
+      </m:oMath>
+      <w:r>
+        <w:t xml:space="preserve"> </w:t>
+      </w:r>
+      <w:r>
+        <w:t xml:space="preserve">regardless of which application they’re scoring. So even if you model the final score conditional on the consensus you will still have a spike, just relocated to wherever a given application’s consensus happened to land. Differencing standardizes the spike’s location (at zero) across every application and makes a shared two-part model feasible.</w:t>
+      </w:r>
+    </w:p>
+    <w:p>
+      <w:pPr>
+        <w:pStyle w:val="Compact"/>
+        <w:numPr>
+          <w:ilvl w:val="0"/>
+          <w:numId w:val="1003"/>
+        </w:numPr>
+      </w:pPr>
+      <w:r>
+        <w:rPr>
+          <w:b/>
+          <w:bCs/>
+        </w:rPr>
+        <w:t xml:space="preserve">Avoids some sources of confounding.</w:t>
+      </w:r>
+      <w:r>
+        <w:t xml:space="preserve"> </w:t>
+      </w:r>
+      <w:r>
+        <w:t xml:space="preserve">The consensus score is constant across everyone in the committee and reflects both the committee’s and the application’s</w:t>
+      </w:r>
+      <w:r>
+        <w:t xml:space="preserve"> </w:t>
+      </w:r>
+      <w:r>
+        <w:t xml:space="preserve">“true quality”</w:t>
+      </w:r>
+      <w:r>
+        <w:t xml:space="preserve"> </w:t>
+      </w:r>
+      <w:r>
+        <w:t xml:space="preserve">signal. Subtracting it off removes anything that’s shared by every member evaluating the same application (committee identity, application quality, etc.), leaving only the within-application variation across panel members as what’s left to explain. If some committees have both higher consensus scores and a different mix of reviewer expertise then consensus and</w:t>
+      </w:r>
+      <w:r>
+        <w:t xml:space="preserve"> </w:t>
+      </w:r>
+      <w:r>
+        <w:t xml:space="preserve">‘expertise’</w:t>
+      </w:r>
+      <w:r>
+        <w:t xml:space="preserve"> </w:t>
+      </w:r>
+      <w:r>
+        <w:t xml:space="preserve">are correlated across applications. Differencing eliminates this potential bias since the coefficient on consensus isn’t estimated at all.</w:t>
+      </w:r>
+    </w:p>
+    <w:p>
+      <w:pPr>
+        <w:pStyle w:val="Compact"/>
+        <w:numPr>
+          <w:ilvl w:val="0"/>
+          <w:numId w:val="1003"/>
+        </w:numPr>
+      </w:pPr>
+      <w:r>
+        <w:rPr>
+          <w:b/>
+          <w:bCs/>
+        </w:rPr>
+        <w:t xml:space="preserve">Matches the actual research question.</w:t>
+      </w:r>
+      <w:r>
+        <w:t xml:space="preserve"> </w:t>
+      </w:r>
+      <w:r>
+        <w:t xml:space="preserve">Aim 1 is about the</w:t>
+      </w:r>
+      <w:r>
+        <w:t xml:space="preserve"> </w:t>
+      </w:r>
+      <w:r>
+        <w:rPr>
+          <w:i/>
+          <w:iCs/>
+        </w:rPr>
+        <w:t xml:space="preserve">change from consensus</w:t>
+      </w:r>
+      <w:r>
+        <w:t xml:space="preserve"> </w:t>
+      </w:r>
+      <w:r>
+        <w:t xml:space="preserve">induced by discussion, not the</w:t>
+      </w:r>
+      <w:r>
+        <w:t xml:space="preserve"> </w:t>
+      </w:r>
+      <w:r>
+        <w:rPr>
+          <w:i/>
+          <w:iCs/>
+        </w:rPr>
+        <w:t xml:space="preserve">level</w:t>
+      </w:r>
+      <w:r>
+        <w:t xml:space="preserve"> </w:t>
+      </w:r>
+      <w:r>
+        <w:t xml:space="preserve">of the final score (driven mostly by application quality). Since it is simple to recover the final score like</w:t>
+      </w:r>
+      <w:r>
+        <w:t xml:space="preserve"> </w:t>
+      </w:r>
+      <m:oMath>
+        <m:r>
+          <m:rPr>
+            <m:nor/>
+            <m:sty m:val="p"/>
+          </m:rPr>
+          <m:t>final score</m:t>
+        </m:r>
+        <m:r>
+          <m:rPr>
+            <m:sty m:val="p"/>
+          </m:rPr>
+          <m:t>=</m:t>
+        </m:r>
+        <m:r>
+          <m:rPr>
+            <m:nor/>
+            <m:sty m:val="p"/>
+          </m:rPr>
+          <m:t>consensus</m:t>
+        </m:r>
+        <m:r>
+          <m:rPr>
+            <m:sty m:val="p"/>
+          </m:rPr>
+          <m:t>+</m:t>
+        </m:r>
+        <m:sSub>
+          <m:e>
+            <m:r>
+              <m:t>d</m:t>
+            </m:r>
+          </m:e>
+          <m:sub>
+            <m:r>
+              <m:t>i</m:t>
+            </m:r>
+            <m:r>
+              <m:t>j</m:t>
+            </m:r>
+            <m:r>
+              <m:t>k</m:t>
+            </m:r>
+          </m:sub>
+        </m:sSub>
+      </m:oMath>
+      <w:r>
+        <w:t xml:space="preserve">, anything Aim 3 needs at the score level for funding-decision simulations can be reconstructed downstream.</w:t>
+      </w:r>
+    </w:p>
     <w:bookmarkStart w:id="24" w:name="estimand-of-interest"/>
     <w:p>
       <w:pPr>
@@ -505,7 +931,7 @@
         <w:pStyle w:val="FirstParagraph"/>
       </w:pPr>
       <w:r>
-        <w:t xml:space="preserve">Our main quantity of interest in this project is the value that a given application score (</w:t>
+        <w:t xml:space="preserve">Our main quantity of interest in this project is the value that a given panel member’s score (</w:t>
       </w:r>
       <m:oMath>
         <m:sSub>
@@ -518,11 +944,17 @@
             <m:r>
               <m:t>i</m:t>
             </m:r>
+            <m:r>
+              <m:t>j</m:t>
+            </m:r>
+            <m:r>
+              <m:t>k</m:t>
+            </m:r>
           </m:sub>
         </m:sSub>
       </m:oMath>
       <w:r>
-        <w:t xml:space="preserve">) would take if a particular reviewer characteristic (role or experience) were set to a specific value, averaged over the entire population of applications. We can write an example of, say, the difference between final scores for an application if it were assigned to a panelist or reviewer:</w:t>
+        <w:t xml:space="preserve">) would take if a particular reviewer characteristic (role or experience) were set to a specific value, averaged over the entire population of panel members, applications, and committees. We can write an example of, say, the difference between final scores for a given member-application pairing if that member were assigned to be a panelist or a reviewer:</w:t>
       </w:r>
     </w:p>
     <w:p>
@@ -549,7 +981,13 @@
                     </m:num>
                     <m:den>
                       <m:r>
-                        <m:t>n</m:t>
+                        <m:t>I</m:t>
+                      </m:r>
+                      <m:r>
+                        <m:t>J</m:t>
+                      </m:r>
+                      <m:r>
+                        <m:t>K</m:t>
                       </m:r>
                     </m:den>
                   </m:f>
@@ -562,7 +1000,7 @@
                     </m:naryPr>
                     <m:sub>
                       <m:r>
-                        <m:t>i</m:t>
+                        <m:t>k</m:t>
                       </m:r>
                       <m:r>
                         <m:rPr>
@@ -576,13 +1014,71 @@
                     </m:sub>
                     <m:sup>
                       <m:r>
-                        <m:t>n</m:t>
+                        <m:t>K</m:t>
                       </m:r>
                     </m:sup>
                     <m:e>
-                      <m:r>
-                        <m:t>​</m:t>
-                      </m:r>
+                      <m:nary>
+                        <m:naryPr>
+                          <m:chr m:val="∑"/>
+                          <m:limLoc m:val="undOvr"/>
+                          <m:subHide m:val="off"/>
+                          <m:supHide m:val="off"/>
+                        </m:naryPr>
+                        <m:sub>
+                          <m:r>
+                            <m:t>j</m:t>
+                          </m:r>
+                          <m:r>
+                            <m:rPr>
+                              <m:sty m:val="p"/>
+                            </m:rPr>
+                            <m:t>=</m:t>
+                          </m:r>
+                          <m:r>
+                            <m:t>1</m:t>
+                          </m:r>
+                        </m:sub>
+                        <m:sup>
+                          <m:r>
+                            <m:t>J</m:t>
+                          </m:r>
+                        </m:sup>
+                        <m:e>
+                          <m:nary>
+                            <m:naryPr>
+                              <m:chr m:val="∑"/>
+                              <m:limLoc m:val="undOvr"/>
+                              <m:subHide m:val="off"/>
+                              <m:supHide m:val="off"/>
+                            </m:naryPr>
+                            <m:sub>
+                              <m:r>
+                                <m:t>i</m:t>
+                              </m:r>
+                              <m:r>
+                                <m:rPr>
+                                  <m:sty m:val="p"/>
+                                </m:rPr>
+                                <m:t>=</m:t>
+                              </m:r>
+                              <m:r>
+                                <m:t>1</m:t>
+                              </m:r>
+                            </m:sub>
+                            <m:sup>
+                              <m:r>
+                                <m:t>I</m:t>
+                              </m:r>
+                            </m:sup>
+                            <m:e>
+                              <m:r>
+                                <m:t>​</m:t>
+                              </m:r>
+                            </m:e>
+                          </m:nary>
+                        </m:e>
+                      </m:nary>
                     </m:e>
                   </m:nary>
                 </m:e>
@@ -617,10 +1113,17 @@
                         <m:nor/>
                         <m:sty m:val="p"/>
                       </m:rPr>
-                      <m:t>Mean over </m:t>
+                      <m:t>Mean over members </m:t>
                     </m:r>
                     <m:r>
                       <m:t>i</m:t>
+                    </m:r>
+                    <m:r>
+                      <m:rPr>
+                        <m:nor/>
+                        <m:sty m:val="p"/>
+                      </m:rPr>
+                      <m:t>,</m:t>
                     </m:r>
                   </m:e>
                 </m:mr>
@@ -631,7 +1134,31 @@
                         <m:nor/>
                         <m:sty m:val="p"/>
                       </m:rPr>
-                      <m:t>applications</m:t>
+                      <m:t>applications </m:t>
+                    </m:r>
+                    <m:r>
+                      <m:t>j</m:t>
+                    </m:r>
+                    <m:r>
+                      <m:rPr>
+                        <m:nor/>
+                        <m:sty m:val="p"/>
+                      </m:rPr>
+                      <m:t>,</m:t>
+                    </m:r>
+                  </m:e>
+                </m:mr>
+                <m:mr>
+                  <m:e>
+                    <m:r>
+                      <m:rPr>
+                        <m:nor/>
+                        <m:sty m:val="p"/>
+                      </m:rPr>
+                      <m:t>and committees </m:t>
+                    </m:r>
+                    <m:r>
+                      <m:t>k</m:t>
                     </m:r>
                   </m:e>
                 </m:mr>
@@ -659,6 +1186,12 @@
                         <m:sub>
                           <m:r>
                             <m:t>i</m:t>
+                          </m:r>
+                          <m:r>
+                            <m:t>j</m:t>
+                          </m:r>
+                          <m:r>
+                            <m:t>k</m:t>
                           </m:r>
                         </m:sub>
                       </m:sSub>
@@ -690,6 +1223,12 @@
                         <m:sub>
                           <m:r>
                             <m:t>i</m:t>
+                          </m:r>
+                          <m:r>
+                            <m:t>j</m:t>
+                          </m:r>
+                          <m:r>
+                            <m:t>k</m:t>
                           </m:r>
                         </m:sub>
                       </m:sSub>
@@ -778,474 +1317,6 @@
       </w:pPr>
       <w:r>
         <w:t xml:space="preserve">Leaving aside for the moment the assumptions needed to credibly estimate this quantity, the specific data generating process for application scores, where there is a consensus score that members can deviate from, leads to considering an alternative outcome, which is the difference between the consensus score and each member’s score. However, this leads to challenges since we might expect many members to just go with and agree on the consensus score.</w:t>
-      </w:r>
-    </w:p>
-    <w:p>
-      <w:pPr>
-        <w:pStyle w:val="BodyText"/>
-      </w:pPr>
-      <w:r>
-        <w:t xml:space="preserve">Let</w:t>
-      </w:r>
-      <w:r>
-        <w:t xml:space="preserve"> </w:t>
-      </w:r>
-      <m:oMath>
-        <m:sSub>
-          <m:e>
-            <m:r>
-              <m:t>d</m:t>
-            </m:r>
-          </m:e>
-          <m:sub>
-            <m:r>
-              <m:t>i</m:t>
-            </m:r>
-            <m:r>
-              <m:t>j</m:t>
-            </m:r>
-            <m:r>
-              <m:t>k</m:t>
-            </m:r>
-          </m:sub>
-        </m:sSub>
-      </m:oMath>
-      <w:r>
-        <w:t xml:space="preserve"> </w:t>
-      </w:r>
-      <w:r>
-        <w:t xml:space="preserve">be the final score minus the consensus score, for the</w:t>
-      </w:r>
-      <w:r>
-        <w:t xml:space="preserve"> </w:t>
-      </w:r>
-      <m:oMath>
-        <m:r>
-          <m:t>i</m:t>
-        </m:r>
-      </m:oMath>
-      <w:r>
-        <w:t xml:space="preserve">th panel member on the</w:t>
-      </w:r>
-      <w:r>
-        <w:t xml:space="preserve"> </w:t>
-      </w:r>
-      <m:oMath>
-        <m:r>
-          <m:t>j</m:t>
-        </m:r>
-      </m:oMath>
-      <w:r>
-        <w:t xml:space="preserve">th application in the</w:t>
-      </w:r>
-      <w:r>
-        <w:t xml:space="preserve"> </w:t>
-      </w:r>
-      <m:oMath>
-        <m:r>
-          <m:t>k</m:t>
-        </m:r>
-      </m:oMath>
-      <w:r>
-        <w:t xml:space="preserve">th committee:</w:t>
-      </w:r>
-    </w:p>
-    <w:p>
-      <w:pPr>
-        <w:pStyle w:val="BodyText"/>
-      </w:pPr>
-      <m:oMathPara>
-        <m:oMathParaPr>
-          <m:jc m:val="center"/>
-        </m:oMathParaPr>
-        <m:oMath>
-          <m:sSub>
-            <m:e>
-              <m:r>
-                <m:t>d</m:t>
-              </m:r>
-            </m:e>
-            <m:sub>
-              <m:r>
-                <m:t>i</m:t>
-              </m:r>
-              <m:r>
-                <m:t>j</m:t>
-              </m:r>
-              <m:r>
-                <m:t>k</m:t>
-              </m:r>
-            </m:sub>
-          </m:sSub>
-          <m:r>
-            <m:rPr>
-              <m:sty m:val="p"/>
-            </m:rPr>
-            <m:t>=</m:t>
-          </m:r>
-          <m:sSub>
-            <m:e>
-              <m:r>
-                <m:rPr>
-                  <m:nor/>
-                  <m:sty m:val="p"/>
-                </m:rPr>
-                <m:t>final score</m:t>
-              </m:r>
-            </m:e>
-            <m:sub>
-              <m:r>
-                <m:t>i</m:t>
-              </m:r>
-              <m:r>
-                <m:t>j</m:t>
-              </m:r>
-              <m:r>
-                <m:t>k</m:t>
-              </m:r>
-            </m:sub>
-          </m:sSub>
-          <m:r>
-            <m:rPr>
-              <m:sty m:val="p"/>
-            </m:rPr>
-            <m:t>−</m:t>
-          </m:r>
-          <m:sSub>
-            <m:e>
-              <m:r>
-                <m:rPr>
-                  <m:nor/>
-                  <m:sty m:val="p"/>
-                </m:rPr>
-                <m:t>consensus score</m:t>
-              </m:r>
-            </m:e>
-            <m:sub>
-              <m:r>
-                <m:t>j</m:t>
-              </m:r>
-              <m:r>
-                <m:t>k</m:t>
-              </m:r>
-            </m:sub>
-          </m:sSub>
-        </m:oMath>
-      </m:oMathPara>
-    </w:p>
-    <w:p>
-      <w:pPr>
-        <w:pStyle w:val="FirstParagraph"/>
-      </w:pPr>
-      <w:r>
-        <w:t xml:space="preserve">We model</w:t>
-      </w:r>
-      <w:r>
-        <w:t xml:space="preserve"> </w:t>
-      </w:r>
-      <m:oMath>
-        <m:sSub>
-          <m:e>
-            <m:r>
-              <m:t>d</m:t>
-            </m:r>
-          </m:e>
-          <m:sub>
-            <m:r>
-              <m:t>i</m:t>
-            </m:r>
-            <m:r>
-              <m:t>j</m:t>
-            </m:r>
-            <m:r>
-              <m:t>k</m:t>
-            </m:r>
-          </m:sub>
-        </m:sSub>
-      </m:oMath>
-      <w:r>
-        <w:t xml:space="preserve"> </w:t>
-      </w:r>
-      <w:r>
-        <w:t xml:space="preserve">directly, rather than modeling the final score with</w:t>
-      </w:r>
-      <w:r>
-        <w:t xml:space="preserve"> </w:t>
-      </w:r>
-      <w:r>
-        <w:t xml:space="preserve">consensus score as a covariate, for three reasons:</w:t>
-      </w:r>
-    </w:p>
-    <w:p>
-      <w:pPr>
-        <w:pStyle w:val="Compact"/>
-        <w:numPr>
-          <w:ilvl w:val="0"/>
-          <w:numId w:val="1003"/>
-        </w:numPr>
-      </w:pPr>
-      <w:r>
-        <w:rPr>
-          <w:b/>
-          <w:bCs/>
-        </w:rPr>
-        <w:t xml:space="preserve">Point mass at zero</w:t>
-      </w:r>
-      <w:r>
-        <w:t xml:space="preserve"> </w:t>
-      </w:r>
-      <w:r>
-        <w:t xml:space="preserve">We hypothesize that most or many members will go with the consensus score, which leads to a mass either at the consensus (if you modeled the score) or a mass at zero if you model the difference. A member who doesn’t</w:t>
-      </w:r>
-      <w:r>
-        <w:t xml:space="preserve"> </w:t>
-      </w:r>
-      <w:r>
-        <w:t xml:space="preserve">move from consensus has</w:t>
-      </w:r>
-      <w:r>
-        <w:t xml:space="preserve"> </w:t>
-      </w:r>
-      <m:oMath>
-        <m:sSub>
-          <m:e>
-            <m:r>
-              <m:t>d</m:t>
-            </m:r>
-          </m:e>
-          <m:sub>
-            <m:r>
-              <m:t>i</m:t>
-            </m:r>
-            <m:r>
-              <m:t>j</m:t>
-            </m:r>
-            <m:r>
-              <m:t>k</m:t>
-            </m:r>
-          </m:sub>
-        </m:sSub>
-        <m:r>
-          <m:rPr>
-            <m:sty m:val="p"/>
-          </m:rPr>
-          <m:t>=</m:t>
-        </m:r>
-        <m:r>
-          <m:t>0</m:t>
-        </m:r>
-      </m:oMath>
-      <w:r>
-        <w:t xml:space="preserve"> </w:t>
-      </w:r>
-      <w:r>
-        <w:t xml:space="preserve">regardless of which application</w:t>
-      </w:r>
-      <w:r>
-        <w:t xml:space="preserve"> </w:t>
-      </w:r>
-      <w:r>
-        <w:t xml:space="preserve">they’re scoring. So even if you model the final score conditional on the consensus you will still have a spike, just relocated to wherever a given application’s consensus happened to land. Differencing standardizes the spike’s location across every application and makes a shared two-part model feasible.</w:t>
-      </w:r>
-    </w:p>
-    <w:p>
-      <w:pPr>
-        <w:pStyle w:val="Compact"/>
-        <w:numPr>
-          <w:ilvl w:val="0"/>
-          <w:numId w:val="1003"/>
-        </w:numPr>
-      </w:pPr>
-      <w:r>
-        <w:rPr>
-          <w:b/>
-          <w:bCs/>
-        </w:rPr>
-        <w:t xml:space="preserve">Avoids reintroducing confounding.</w:t>
-      </w:r>
-      <w:r>
-        <w:t xml:space="preserve"> </w:t>
-      </w:r>
-      <w:r>
-        <w:t xml:space="preserve">A freely estimated slope on</w:t>
-      </w:r>
-      <w:r>
-        <w:t xml:space="preserve"> </w:t>
-      </w:r>
-      <w:r>
-        <w:t xml:space="preserve">consensus in a</w:t>
-      </w:r>
-      <w:r>
-        <w:t xml:space="preserve"> </w:t>
-      </w:r>
-      <w:r>
-        <w:rPr>
-          <w:rStyle w:val="VerbatimChar"/>
-        </w:rPr>
-        <w:t xml:space="preserve">final_score ~ consensus + ...</w:t>
-      </w:r>
-      <w:r>
-        <w:t xml:space="preserve"> </w:t>
-      </w:r>
-      <w:r>
-        <w:t xml:space="preserve">model has to recover</w:t>
-      </w:r>
-      <w:r>
-        <w:t xml:space="preserve"> </w:t>
-      </w:r>
-      <w:r>
-        <w:t xml:space="preserve">something close to 1 from the data; if reviewer composition happens to</w:t>
-      </w:r>
-      <w:r>
-        <w:t xml:space="preserve"> </w:t>
-      </w:r>
-      <w:r>
-        <w:t xml:space="preserve">correlate with consensus level across committees, that estimation can</w:t>
-      </w:r>
-      <w:r>
-        <w:t xml:space="preserve"> </w:t>
-      </w:r>
-      <w:r>
-        <w:t xml:space="preserve">leak into the coefficients we actually care about. Differencing with an</w:t>
-      </w:r>
-      <w:r>
-        <w:t xml:space="preserve"> </w:t>
-      </w:r>
-      <w:r>
-        <w:t xml:space="preserve">implicit slope of exactly 1 – the true administrative rule, not an</w:t>
-      </w:r>
-      <w:r>
-        <w:t xml:space="preserve"> </w:t>
-      </w:r>
-      <w:r>
-        <w:t xml:space="preserve">assumption – removes that channel by construction.</w:t>
-      </w:r>
-    </w:p>
-    <w:p>
-      <w:pPr>
-        <w:pStyle w:val="Compact"/>
-        <w:numPr>
-          <w:ilvl w:val="0"/>
-          <w:numId w:val="1003"/>
-        </w:numPr>
-      </w:pPr>
-      <w:r>
-        <w:rPr>
-          <w:b/>
-          <w:bCs/>
-        </w:rPr>
-        <w:t xml:space="preserve">Matches the actual research question.</w:t>
-      </w:r>
-      <w:r>
-        <w:t xml:space="preserve"> </w:t>
-      </w:r>
-      <w:r>
-        <w:t xml:space="preserve">Aim 1 is about the</w:t>
-      </w:r>
-      <w:r>
-        <w:t xml:space="preserve"> </w:t>
-      </w:r>
-      <w:r>
-        <w:rPr>
-          <w:i/>
-          <w:iCs/>
-        </w:rPr>
-        <w:t xml:space="preserve">change from consensus</w:t>
-      </w:r>
-      <w:r>
-        <w:t xml:space="preserve"> </w:t>
-      </w:r>
-      <w:r>
-        <w:t xml:space="preserve">induced by discussion, not the</w:t>
-      </w:r>
-      <w:r>
-        <w:t xml:space="preserve"> </w:t>
-      </w:r>
-      <w:r>
-        <w:rPr>
-          <w:i/>
-          <w:iCs/>
-        </w:rPr>
-        <w:t xml:space="preserve">level</w:t>
-      </w:r>
-      <w:r>
-        <w:t xml:space="preserve"> </w:t>
-      </w:r>
-      <w:r>
-        <w:t xml:space="preserve">of the final score (driven mostly</w:t>
-      </w:r>
-      <w:r>
-        <w:t xml:space="preserve"> </w:t>
-      </w:r>
-      <w:r>
-        <w:t xml:space="preserve">by application quality, which isn’t under study here). Nothing is lost:</w:t>
-      </w:r>
-      <w:r>
-        <w:t xml:space="preserve"> </w:t>
-      </w:r>
-      <m:oMath>
-        <m:r>
-          <m:rPr>
-            <m:nor/>
-            <m:sty m:val="p"/>
-          </m:rPr>
-          <m:t>final score</m:t>
-        </m:r>
-        <m:r>
-          <m:rPr>
-            <m:sty m:val="p"/>
-          </m:rPr>
-          <m:t>=</m:t>
-        </m:r>
-        <m:r>
-          <m:rPr>
-            <m:nor/>
-            <m:sty m:val="p"/>
-          </m:rPr>
-          <m:t>consensus</m:t>
-        </m:r>
-        <m:r>
-          <m:rPr>
-            <m:sty m:val="p"/>
-          </m:rPr>
-          <m:t>+</m:t>
-        </m:r>
-        <m:sSub>
-          <m:e>
-            <m:r>
-              <m:t>d</m:t>
-            </m:r>
-          </m:e>
-          <m:sub>
-            <m:r>
-              <m:t>i</m:t>
-            </m:r>
-            <m:r>
-              <m:t>j</m:t>
-            </m:r>
-            <m:r>
-              <m:t>k</m:t>
-            </m:r>
-          </m:sub>
-        </m:sSub>
-      </m:oMath>
-      <w:r>
-        <w:t xml:space="preserve"> </w:t>
-      </w:r>
-      <w:r>
-        <w:t xml:space="preserve">is a trivial identity,</w:t>
-      </w:r>
-      <w:r>
-        <w:t xml:space="preserve"> </w:t>
-      </w:r>
-      <w:r>
-        <w:t xml:space="preserve">so anything Aim 3 needs at the score level for funding-decision</w:t>
-      </w:r>
-      <w:r>
-        <w:t xml:space="preserve"> </w:t>
-      </w:r>
-      <w:r>
-        <w:t xml:space="preserve">simulations can be reconstructed downstream.</w:t>
       </w:r>
     </w:p>
     <w:bookmarkEnd w:id="24"/>
@@ -1807,7 +1878,7 @@
               <w:pStyle w:val="Compact"/>
             </w:pPr>
             <w:r>
-              <w:t xml:space="preserve">-0.964</w:t>
+              <w:t xml:space="preserve">-0.954</w:t>
             </w:r>
           </w:p>
         </w:tc>
@@ -1863,7 +1934,7 @@
               <w:pStyle w:val="Compact"/>
             </w:pPr>
             <w:r>
-              <w:t xml:space="preserve">-0.004</w:t>
+              <w:t xml:space="preserve">-0.003</w:t>
             </w:r>
           </w:p>
         </w:tc>
@@ -1874,7 +1945,7 @@
               <w:pStyle w:val="Compact"/>
             </w:pPr>
             <w:r>
-              <w:t xml:space="preserve">-0.274</w:t>
+              <w:t xml:space="preserve">-0.303</w:t>
             </w:r>
           </w:p>
         </w:tc>
@@ -1930,7 +2001,7 @@
               <w:pStyle w:val="Compact"/>
             </w:pPr>
             <w:r>
-              <w:t xml:space="preserve">0.004</w:t>
+              <w:t xml:space="preserve">0.003</w:t>
             </w:r>
           </w:p>
         </w:tc>
@@ -1941,7 +2012,7 @@
               <w:pStyle w:val="Compact"/>
             </w:pPr>
             <w:r>
-              <w:t xml:space="preserve">0.654</w:t>
+              <w:t xml:space="preserve">0.643</w:t>
             </w:r>
           </w:p>
         </w:tc>
@@ -1997,7 +2068,7 @@
               <w:pStyle w:val="Compact"/>
             </w:pPr>
             <w:r>
-              <w:t xml:space="preserve">0.000</w:t>
+              <w:t xml:space="preserve">0.002</w:t>
             </w:r>
           </w:p>
         </w:tc>
@@ -2008,7 +2079,7 @@
               <w:pStyle w:val="Compact"/>
             </w:pPr>
             <w:r>
-              <w:t xml:space="preserve">0.447</w:t>
+              <w:t xml:space="preserve">0.467</w:t>
             </w:r>
           </w:p>
         </w:tc>
@@ -2075,7 +2146,7 @@
               <w:pStyle w:val="Compact"/>
             </w:pPr>
             <w:r>
-              <w:t xml:space="preserve">0.938</w:t>
+              <w:t xml:space="preserve">0.857</w:t>
             </w:r>
           </w:p>
         </w:tc>
@@ -2300,7 +2371,7 @@
       </w:r>
     </w:p>
     <w:bookmarkEnd w:id="26"/>
-    <w:bookmarkStart w:id="44" w:name="model-specification-aim-1"/>
+    <w:bookmarkStart w:id="45" w:name="model-specification-aim-1"/>
     <w:p>
       <w:pPr>
         <w:pStyle w:val="Heading1"/>
@@ -2482,7 +2553,7 @@
               <w:jc w:val="center"/>
             </w:pPr>
             <w:pPr>
-              <w:jc w:val="left"/>
+              <w:jc w:val="start"/>
               <w:spacing w:before="200"/>
               <w:pStyle w:val="ImageCaption"/>
             </w:pPr>
@@ -2580,7 +2651,7 @@
               <w:jc w:val="center"/>
             </w:pPr>
             <w:pPr>
-              <w:jc w:val="left"/>
+              <w:jc w:val="start"/>
               <w:spacing w:before="200"/>
               <w:pStyle w:val="ImageCaption"/>
             </w:pPr>
@@ -2678,7 +2749,7 @@
               <w:jc w:val="center"/>
             </w:pPr>
             <w:pPr>
-              <w:jc w:val="left"/>
+              <w:jc w:val="start"/>
               <w:spacing w:before="200"/>
               <w:pStyle w:val="ImageCaption"/>
             </w:pPr>
@@ -2691,7 +2762,7 @@
       </w:tr>
     </w:tbl>
     <w:bookmarkEnd w:id="40"/>
-    <w:bookmarkStart w:id="41" w:name="part-1-did-this-member-deviate"/>
+    <w:bookmarkStart w:id="42" w:name="part-1-did-this-member-deviate"/>
     <w:p>
       <w:pPr>
         <w:pStyle w:val="Heading2"/>
@@ -2795,8 +2866,748 @@
         <w:t xml:space="preserve">draws to check against before trusting the posterior.</w:t>
       </w:r>
     </w:p>
-    <w:bookmarkEnd w:id="41"/>
-    <w:bookmarkStart w:id="42" w:name="part-2-how-large-given-a-deviation"/>
+    <w:p>
+      <w:pPr>
+        <w:pStyle w:val="BodyText"/>
+      </w:pPr>
+      <w:r>
+        <w:t xml:space="preserve">This model run on the simulated data gives the following estimates, shown in</w:t>
+      </w:r>
+      <w:r>
+        <w:t xml:space="preserve"> </w:t>
+      </w:r>
+      <w:hyperlink w:anchor="tbl-m1-deviate">
+        <w:r>
+          <w:rPr>
+            <w:rStyle w:val="Hyperlink"/>
+          </w:rPr>
+          <w:t xml:space="preserve">Table 1</w:t>
+        </w:r>
+      </w:hyperlink>
+      <w:r>
+        <w:t xml:space="preserve">:</w:t>
+      </w:r>
+    </w:p>
+    <w:tbl>
+      <w:tblPr>
+        <w:tblStyle w:val="Table"/>
+        <w:tblW w:type="pct" w:w="5000"/>
+        <w:tblLayout w:type="fixed"/>
+        <w:tblLook w:firstRow="0" w:lastRow="0" w:firstColumn="0" w:lastColumn="0" w:noHBand="0" w:noVBand="0" w:val="0000"/>
+      </w:tblPr>
+      <w:tblGrid>
+        <w:gridCol w:w="7920"/>
+      </w:tblGrid>
+      <w:tr>
+        <w:tc>
+          <w:tcPr/>
+          <w:bookmarkStart w:id="41" w:name="tbl-m1-deviate"/>
+          <w:p>
+            <w:pPr>
+              <w:jc w:val="center"/>
+            </w:pPr>
+            <w:pPr>
+              <w:jc w:val="start"/>
+              <w:spacing w:before="200"/>
+              <w:pStyle w:val="ImageCaption"/>
+            </w:pPr>
+            <w:r>
+              <w:t xml:space="preserve">Table 1: Posterior estimates: m1_deviate</w:t>
+            </w:r>
+          </w:p>
+          <w:p>
+            <w:pPr>
+              <w:pStyle w:val="Compact"/>
+              <w:jc w:val="center"/>
+            </w:pPr>
+            <w:r>
+              <w:t xml:space="preserve">Posterior estimates: m1_deviate</w:t>
+            </w:r>
+          </w:p>
+          <w:tbl>
+            <w:tblPr>
+              <w:tblStyle w:val="Table"/>
+              <w:tblW w:type="pct" w:w="4817"/>
+              <w:tblLayout w:type="fixed"/>
+              <w:tblLook w:firstRow="1" w:lastRow="0" w:firstColumn="0" w:lastColumn="0" w:noHBand="0" w:noVBand="0" w:val="0020"/>
+              <w:tblCaption w:val="Posterior estimates: m1_deviate"/>
+            </w:tblPr>
+            <w:tblGrid>
+              <w:gridCol w:w="2704"/>
+              <w:gridCol w:w="1062"/>
+              <w:gridCol w:w="772"/>
+              <w:gridCol w:w="1545"/>
+              <w:gridCol w:w="1545"/>
+            </w:tblGrid>
+            <w:tr>
+              <w:trPr>
+                <w:tblHeader w:val="on"/>
+              </w:trPr>
+              <w:tc>
+                <w:tcPr/>
+                <w:p>
+                  <w:pPr>
+                    <w:pStyle w:val="Compact"/>
+                    <w:jc w:val="center"/>
+                  </w:pPr>
+                  <w:r>
+                    <w:t xml:space="preserve">Parameter</w:t>
+                  </w:r>
+                </w:p>
+              </w:tc>
+              <w:tc>
+                <w:tcPr/>
+                <w:p>
+                  <w:pPr>
+                    <w:pStyle w:val="Compact"/>
+                    <w:jc w:val="center"/>
+                  </w:pPr>
+                  <w:r>
+                    <w:t xml:space="preserve">Estimate</w:t>
+                  </w:r>
+                </w:p>
+              </w:tc>
+              <w:tc>
+                <w:tcPr/>
+                <w:p>
+                  <w:pPr>
+                    <w:pStyle w:val="Compact"/>
+                    <w:jc w:val="center"/>
+                  </w:pPr>
+                  <w:r>
+                    <w:t xml:space="preserve">Error</w:t>
+                  </w:r>
+                </w:p>
+              </w:tc>
+              <w:tc>
+                <w:tcPr/>
+                <w:p>
+                  <w:pPr>
+                    <w:pStyle w:val="Compact"/>
+                    <w:jc w:val="center"/>
+                  </w:pPr>
+                  <w:r>
+                    <w:t xml:space="preserve">95% CrI Lower</w:t>
+                  </w:r>
+                </w:p>
+              </w:tc>
+              <w:tc>
+                <w:tcPr/>
+                <w:p>
+                  <w:pPr>
+                    <w:pStyle w:val="Compact"/>
+                    <w:jc w:val="center"/>
+                  </w:pPr>
+                  <w:r>
+                    <w:t xml:space="preserve">95% CrI Upper</w:t>
+                  </w:r>
+                </w:p>
+              </w:tc>
+            </w:tr>
+            <w:tr>
+              <w:tc>
+                <w:tcPr>
+                  <w:gridSpan w:val="5"/>
+                </w:tcPr>
+                <w:p>
+                  <w:pPr>
+                    <w:pStyle w:val="Compact"/>
+                    <w:jc w:val="center"/>
+                  </w:pPr>
+                  <w:r>
+                    <w:rPr>
+                      <w:i/>
+                      <w:iCs/>
+                    </w:rPr>
+                    <w:t xml:space="preserve">Fixed effects (log odds)</w:t>
+                  </w:r>
+                </w:p>
+              </w:tc>
+            </w:tr>
+            <w:tr>
+              <w:tc>
+                <w:tcPr/>
+                <w:p>
+                  <w:pPr>
+                    <w:pStyle w:val="Compact"/>
+                    <w:jc w:val="center"/>
+                  </w:pPr>
+                  <w:r>
+                    <w:t xml:space="preserve">Intercept</w:t>
+                  </w:r>
+                </w:p>
+              </w:tc>
+              <w:tc>
+                <w:tcPr/>
+                <w:p>
+                  <w:pPr>
+                    <w:pStyle w:val="Compact"/>
+                    <w:jc w:val="center"/>
+                  </w:pPr>
+                  <w:r>
+                    <w:t xml:space="preserve">-0.789</w:t>
+                  </w:r>
+                </w:p>
+              </w:tc>
+              <w:tc>
+                <w:tcPr/>
+                <w:p>
+                  <w:pPr>
+                    <w:pStyle w:val="Compact"/>
+                    <w:jc w:val="center"/>
+                  </w:pPr>
+                  <w:r>
+                    <w:t xml:space="preserve">0.051</w:t>
+                  </w:r>
+                </w:p>
+              </w:tc>
+              <w:tc>
+                <w:tcPr/>
+                <w:p>
+                  <w:pPr>
+                    <w:pStyle w:val="Compact"/>
+                    <w:jc w:val="center"/>
+                  </w:pPr>
+                  <w:r>
+                    <w:t xml:space="preserve">-0.887</w:t>
+                  </w:r>
+                </w:p>
+              </w:tc>
+              <w:tc>
+                <w:tcPr/>
+                <w:p>
+                  <w:pPr>
+                    <w:pStyle w:val="Compact"/>
+                    <w:jc w:val="center"/>
+                  </w:pPr>
+                  <w:r>
+                    <w:t xml:space="preserve">-0.694</w:t>
+                  </w:r>
+                </w:p>
+              </w:tc>
+            </w:tr>
+            <w:tr>
+              <w:tc>
+                <w:tcPr/>
+                <w:p>
+                  <w:pPr>
+                    <w:pStyle w:val="Compact"/>
+                    <w:jc w:val="center"/>
+                  </w:pPr>
+                  <w:r>
+                    <w:t xml:space="preserve">Panelist vs. Reviewer</w:t>
+                  </w:r>
+                </w:p>
+              </w:tc>
+              <w:tc>
+                <w:tcPr/>
+                <w:p>
+                  <w:pPr>
+                    <w:pStyle w:val="Compact"/>
+                    <w:jc w:val="center"/>
+                  </w:pPr>
+                  <w:r>
+                    <w:t xml:space="preserve">0.300</w:t>
+                  </w:r>
+                </w:p>
+              </w:tc>
+              <w:tc>
+                <w:tcPr/>
+                <w:p>
+                  <w:pPr>
+                    <w:pStyle w:val="Compact"/>
+                    <w:jc w:val="center"/>
+                  </w:pPr>
+                  <w:r>
+                    <w:t xml:space="preserve">0.049</w:t>
+                  </w:r>
+                </w:p>
+              </w:tc>
+              <w:tc>
+                <w:tcPr/>
+                <w:p>
+                  <w:pPr>
+                    <w:pStyle w:val="Compact"/>
+                    <w:jc w:val="center"/>
+                  </w:pPr>
+                  <w:r>
+                    <w:t xml:space="preserve">0.208</w:t>
+                  </w:r>
+                </w:p>
+              </w:tc>
+              <w:tc>
+                <w:tcPr/>
+                <w:p>
+                  <w:pPr>
+                    <w:pStyle w:val="Compact"/>
+                    <w:jc w:val="center"/>
+                  </w:pPr>
+                  <w:r>
+                    <w:t xml:space="preserve">0.397</w:t>
+                  </w:r>
+                </w:p>
+              </w:tc>
+            </w:tr>
+            <w:tr>
+              <w:tc>
+                <w:tcPr/>
+                <w:p>
+                  <w:pPr>
+                    <w:pStyle w:val="Compact"/>
+                    <w:jc w:val="center"/>
+                  </w:pPr>
+                  <w:r>
+                    <w:t xml:space="preserve">High vs. Medium Expertise</w:t>
+                  </w:r>
+                </w:p>
+              </w:tc>
+              <w:tc>
+                <w:tcPr/>
+                <w:p>
+                  <w:pPr>
+                    <w:pStyle w:val="Compact"/>
+                    <w:jc w:val="center"/>
+                  </w:pPr>
+                  <w:r>
+                    <w:t xml:space="preserve">-0.467</w:t>
+                  </w:r>
+                </w:p>
+              </w:tc>
+              <w:tc>
+                <w:tcPr/>
+                <w:p>
+                  <w:pPr>
+                    <w:pStyle w:val="Compact"/>
+                    <w:jc w:val="center"/>
+                  </w:pPr>
+                  <w:r>
+                    <w:t xml:space="preserve">0.042</w:t>
+                  </w:r>
+                </w:p>
+              </w:tc>
+              <w:tc>
+                <w:tcPr/>
+                <w:p>
+                  <w:pPr>
+                    <w:pStyle w:val="Compact"/>
+                    <w:jc w:val="center"/>
+                  </w:pPr>
+                  <w:r>
+                    <w:t xml:space="preserve">-0.547</w:t>
+                  </w:r>
+                </w:p>
+              </w:tc>
+              <w:tc>
+                <w:tcPr/>
+                <w:p>
+                  <w:pPr>
+                    <w:pStyle w:val="Compact"/>
+                    <w:jc w:val="center"/>
+                  </w:pPr>
+                  <w:r>
+                    <w:t xml:space="preserve">-0.385</w:t>
+                  </w:r>
+                </w:p>
+              </w:tc>
+            </w:tr>
+            <w:tr>
+              <w:tc>
+                <w:tcPr/>
+                <w:p>
+                  <w:pPr>
+                    <w:pStyle w:val="Compact"/>
+                    <w:jc w:val="center"/>
+                  </w:pPr>
+                  <w:r>
+                    <w:t xml:space="preserve">Low vs. Medium Expertise</w:t>
+                  </w:r>
+                </w:p>
+              </w:tc>
+              <w:tc>
+                <w:tcPr/>
+                <w:p>
+                  <w:pPr>
+                    <w:pStyle w:val="Compact"/>
+                    <w:jc w:val="center"/>
+                  </w:pPr>
+                  <w:r>
+                    <w:t xml:space="preserve">0.175</w:t>
+                  </w:r>
+                </w:p>
+              </w:tc>
+              <w:tc>
+                <w:tcPr/>
+                <w:p>
+                  <w:pPr>
+                    <w:pStyle w:val="Compact"/>
+                    <w:jc w:val="center"/>
+                  </w:pPr>
+                  <w:r>
+                    <w:t xml:space="preserve">0.044</w:t>
+                  </w:r>
+                </w:p>
+              </w:tc>
+              <w:tc>
+                <w:tcPr/>
+                <w:p>
+                  <w:pPr>
+                    <w:pStyle w:val="Compact"/>
+                    <w:jc w:val="center"/>
+                  </w:pPr>
+                  <w:r>
+                    <w:t xml:space="preserve">0.089</w:t>
+                  </w:r>
+                </w:p>
+              </w:tc>
+              <w:tc>
+                <w:tcPr/>
+                <w:p>
+                  <w:pPr>
+                    <w:pStyle w:val="Compact"/>
+                    <w:jc w:val="center"/>
+                  </w:pPr>
+                  <w:r>
+                    <w:t xml:space="preserve">0.262</w:t>
+                  </w:r>
+                </w:p>
+              </w:tc>
+            </w:tr>
+            <w:tr>
+              <w:tc>
+                <w:tcPr/>
+                <w:p>
+                  <w:pPr>
+                    <w:pStyle w:val="Compact"/>
+                    <w:jc w:val="center"/>
+                  </w:pPr>
+                  <w:r>
+                    <w:t xml:space="preserve">No Expertise vs. Medium</w:t>
+                  </w:r>
+                </w:p>
+              </w:tc>
+              <w:tc>
+                <w:tcPr/>
+                <w:p>
+                  <w:pPr>
+                    <w:pStyle w:val="Compact"/>
+                    <w:jc w:val="center"/>
+                  </w:pPr>
+                  <w:r>
+                    <w:t xml:space="preserve">0.388</w:t>
+                  </w:r>
+                </w:p>
+              </w:tc>
+              <w:tc>
+                <w:tcPr/>
+                <w:p>
+                  <w:pPr>
+                    <w:pStyle w:val="Compact"/>
+                    <w:jc w:val="center"/>
+                  </w:pPr>
+                  <w:r>
+                    <w:t xml:space="preserve">0.043</w:t>
+                  </w:r>
+                </w:p>
+              </w:tc>
+              <w:tc>
+                <w:tcPr/>
+                <w:p>
+                  <w:pPr>
+                    <w:pStyle w:val="Compact"/>
+                    <w:jc w:val="center"/>
+                  </w:pPr>
+                  <w:r>
+                    <w:t xml:space="preserve">0.304</w:t>
+                  </w:r>
+                </w:p>
+              </w:tc>
+              <w:tc>
+                <w:tcPr/>
+                <w:p>
+                  <w:pPr>
+                    <w:pStyle w:val="Compact"/>
+                    <w:jc w:val="center"/>
+                  </w:pPr>
+                  <w:r>
+                    <w:t xml:space="preserve">0.476</w:t>
+                  </w:r>
+                </w:p>
+              </w:tc>
+            </w:tr>
+            <w:tr>
+              <w:tc>
+                <w:tcPr>
+                  <w:gridSpan w:val="5"/>
+                </w:tcPr>
+                <w:p>
+                  <w:pPr>
+                    <w:pStyle w:val="Compact"/>
+                    <w:jc w:val="center"/>
+                  </w:pPr>
+                  <w:r>
+                    <w:rPr>
+                      <w:i/>
+                      <w:iCs/>
+                    </w:rPr>
+                    <w:t xml:space="preserve">Random effects (SD)</w:t>
+                  </w:r>
+                </w:p>
+              </w:tc>
+            </w:tr>
+            <w:tr>
+              <w:tc>
+                <w:tcPr/>
+                <w:p>
+                  <w:pPr>
+                    <w:pStyle w:val="Compact"/>
+                    <w:jc w:val="center"/>
+                  </w:pPr>
+                  <w:r>
+                    <w:t xml:space="preserve">Application</w:t>
+                  </w:r>
+                </w:p>
+              </w:tc>
+              <w:tc>
+                <w:tcPr/>
+                <w:p>
+                  <w:pPr>
+                    <w:pStyle w:val="Compact"/>
+                    <w:jc w:val="center"/>
+                  </w:pPr>
+                  <w:r>
+                    <w:t xml:space="preserve">0.015</w:t>
+                  </w:r>
+                </w:p>
+              </w:tc>
+              <w:tc>
+                <w:tcPr/>
+                <w:p>
+                  <w:pPr>
+                    <w:pStyle w:val="Compact"/>
+                    <w:jc w:val="center"/>
+                  </w:pPr>
+                  <w:r>
+                    <w:t xml:space="preserve">0.014</w:t>
+                  </w:r>
+                </w:p>
+              </w:tc>
+              <w:tc>
+                <w:tcPr/>
+                <w:p>
+                  <w:pPr>
+                    <w:pStyle w:val="Compact"/>
+                    <w:jc w:val="center"/>
+                  </w:pPr>
+                  <w:r>
+                    <w:t xml:space="preserve">0.001</w:t>
+                  </w:r>
+                </w:p>
+              </w:tc>
+              <w:tc>
+                <w:tcPr/>
+                <w:p>
+                  <w:pPr>
+                    <w:pStyle w:val="Compact"/>
+                    <w:jc w:val="center"/>
+                  </w:pPr>
+                  <w:r>
+                    <w:t xml:space="preserve">0.053</w:t>
+                  </w:r>
+                </w:p>
+              </w:tc>
+            </w:tr>
+            <w:tr>
+              <w:tc>
+                <w:tcPr/>
+                <w:p>
+                  <w:pPr>
+                    <w:pStyle w:val="Compact"/>
+                    <w:jc w:val="center"/>
+                  </w:pPr>
+                  <w:r>
+                    <w:t xml:space="preserve">Committee Member</w:t>
+                  </w:r>
+                </w:p>
+              </w:tc>
+              <w:tc>
+                <w:tcPr/>
+                <w:p>
+                  <w:pPr>
+                    <w:pStyle w:val="Compact"/>
+                    <w:jc w:val="center"/>
+                  </w:pPr>
+                  <w:r>
+                    <w:t xml:space="preserve">0.046</w:t>
+                  </w:r>
+                </w:p>
+              </w:tc>
+              <w:tc>
+                <w:tcPr/>
+                <w:p>
+                  <w:pPr>
+                    <w:pStyle w:val="Compact"/>
+                    <w:jc w:val="center"/>
+                  </w:pPr>
+                  <w:r>
+                    <w:t xml:space="preserve">0.039</w:t>
+                  </w:r>
+                </w:p>
+              </w:tc>
+              <w:tc>
+                <w:tcPr/>
+                <w:p>
+                  <w:pPr>
+                    <w:pStyle w:val="Compact"/>
+                    <w:jc w:val="center"/>
+                  </w:pPr>
+                  <w:r>
+                    <w:t xml:space="preserve">0.002</w:t>
+                  </w:r>
+                </w:p>
+              </w:tc>
+              <w:tc>
+                <w:tcPr/>
+                <w:p>
+                  <w:pPr>
+                    <w:pStyle w:val="Compact"/>
+                    <w:jc w:val="center"/>
+                  </w:pPr>
+                  <w:r>
+                    <w:t xml:space="preserve">0.134</w:t>
+                  </w:r>
+                </w:p>
+              </w:tc>
+            </w:tr>
+            <w:tr>
+              <w:tc>
+                <w:tcPr/>
+                <w:p>
+                  <w:pPr>
+                    <w:pStyle w:val="Compact"/>
+                    <w:jc w:val="center"/>
+                  </w:pPr>
+                  <w:r>
+                    <w:t xml:space="preserve">Committee</w:t>
+                  </w:r>
+                </w:p>
+              </w:tc>
+              <w:tc>
+                <w:tcPr/>
+                <w:p>
+                  <w:pPr>
+                    <w:pStyle w:val="Compact"/>
+                    <w:jc w:val="center"/>
+                  </w:pPr>
+                  <w:r>
+                    <w:t xml:space="preserve">0.034</w:t>
+                  </w:r>
+                </w:p>
+              </w:tc>
+              <w:tc>
+                <w:tcPr/>
+                <w:p>
+                  <w:pPr>
+                    <w:pStyle w:val="Compact"/>
+                    <w:jc w:val="center"/>
+                  </w:pPr>
+                  <w:r>
+                    <w:t xml:space="preserve">0.026</w:t>
+                  </w:r>
+                </w:p>
+              </w:tc>
+              <w:tc>
+                <w:tcPr/>
+                <w:p>
+                  <w:pPr>
+                    <w:pStyle w:val="Compact"/>
+                    <w:jc w:val="center"/>
+                  </w:pPr>
+                  <w:r>
+                    <w:t xml:space="preserve">0.002</w:t>
+                  </w:r>
+                </w:p>
+              </w:tc>
+              <w:tc>
+                <w:tcPr/>
+                <w:p>
+                  <w:pPr>
+                    <w:pStyle w:val="Compact"/>
+                    <w:jc w:val="center"/>
+                  </w:pPr>
+                  <w:r>
+                    <w:t xml:space="preserve">0.088</w:t>
+                  </w:r>
+                </w:p>
+              </w:tc>
+            </w:tr>
+          </w:tbl>
+          <w:p>
+            <w:pPr>
+              <w:jc w:val="center"/>
+            </w:pPr>
+            <w:r>
+              <w:t xml:space="preserve">Estimates from deviation model</w:t>
+            </w:r>
+          </w:p>
+          <w:bookmarkEnd w:id="41"/>
+        </w:tc>
+      </w:tr>
+    </w:tbl>
+    <w:p>
+      <w:pPr>
+        <w:pStyle w:val="BodyText"/>
+      </w:pPr>
+      <w:r>
+        <w:t xml:space="preserve">From the fixed effects we see that we generally recover the simulated parameters. We can also generate the estimated absolute probabilities of deviating and how those are affected by</w:t>
+      </w:r>
+      <w:r>
+        <w:t xml:space="preserve"> </w:t>
+      </w:r>
+      <w:r>
+        <w:rPr>
+          <w:rStyle w:val="VerbatimChar"/>
+        </w:rPr>
+        <w:t xml:space="preserve">job</w:t>
+      </w:r>
+      <w:r>
+        <w:t xml:space="preserve"> </w:t>
+      </w:r>
+      <w:r>
+        <w:t xml:space="preserve">and</w:t>
+      </w:r>
+      <w:r>
+        <w:t xml:space="preserve"> </w:t>
+      </w:r>
+      <w:r>
+        <w:rPr>
+          <w:rStyle w:val="VerbatimChar"/>
+        </w:rPr>
+        <w:t xml:space="preserve">expertise</w:t>
+      </w:r>
+      <w:r>
+        <w:t xml:space="preserve"> </w:t>
+      </w:r>
+      <w:r>
+        <w:t xml:space="preserve">using the</w:t>
+      </w:r>
+      <w:r>
+        <w:t xml:space="preserve"> </w:t>
+      </w:r>
+      <w:r>
+        <w:rPr>
+          <w:rStyle w:val="VerbatimChar"/>
+        </w:rPr>
+        <w:t xml:space="preserve">marginaleffects</w:t>
+      </w:r>
+      <w:r>
+        <w:t xml:space="preserve"> </w:t>
+      </w:r>
+      <w:r>
+        <w:t xml:space="preserve">package</w:t>
+      </w:r>
+    </w:p>
+    <w:bookmarkEnd w:id="42"/>
+    <w:bookmarkStart w:id="43" w:name="part-2-how-large-given-a-deviation"/>
     <w:p>
       <w:pPr>
         <w:pStyle w:val="Heading2"/>
@@ -3178,8 +3989,8 @@
         <w:t xml:space="preserve">implemented in code – see Open Questions below.</w:t>
       </w:r>
     </w:p>
-    <w:bookmarkEnd w:id="42"/>
-    <w:bookmarkStart w:id="43" w:name="software"/>
+    <w:bookmarkEnd w:id="43"/>
+    <w:bookmarkStart w:id="44" w:name="software"/>
     <w:p>
       <w:pPr>
         <w:pStyle w:val="Heading2"/>
@@ -3274,9 +4085,9 @@
         <w:t xml:space="preserve">silently reused) whenever formula or data change.</w:t>
       </w:r>
     </w:p>
-    <w:bookmarkEnd w:id="43"/>
     <w:bookmarkEnd w:id="44"/>
-    <w:bookmarkStart w:id="45" w:name="Xa4f644ee47bdf4bb1fb2a41d5776bf65cc4489c"/>
+    <w:bookmarkEnd w:id="45"/>
+    <w:bookmarkStart w:id="46" w:name="Xa4f644ee47bdf4bb1fb2a41d5776bf65cc4489c"/>
     <w:p>
       <w:pPr>
         <w:pStyle w:val="Heading1"/>
@@ -3978,8 +4789,8 @@
         <w:t xml:space="preserve">that would be tested against it isn’t written yet.</w:t>
       </w:r>
     </w:p>
-    <w:bookmarkEnd w:id="45"/>
-    <w:bookmarkStart w:id="46" w:name="aim-3-not-yet-designed"/>
+    <w:bookmarkEnd w:id="46"/>
+    <w:bookmarkStart w:id="47" w:name="aim-3-not-yet-designed"/>
     <w:p>
       <w:pPr>
         <w:pStyle w:val="Heading1"/>
@@ -4038,8 +4849,8 @@
         <w:t xml:space="preserve">schemes worth simulating actually are before building anything.</w:t>
       </w:r>
     </w:p>
-    <w:bookmarkEnd w:id="46"/>
-    <w:bookmarkStart w:id="47" w:name="a-note-on-simulation-architecture"/>
+    <w:bookmarkEnd w:id="47"/>
+    <w:bookmarkStart w:id="48" w:name="a-note-on-simulation-architecture"/>
     <w:p>
       <w:pPr>
         <w:pStyle w:val="Heading1"/>
@@ -4113,8 +4924,8 @@
         <w:t xml:space="preserve">reason about in isolation.</w:t>
       </w:r>
     </w:p>
-    <w:bookmarkEnd w:id="47"/>
-    <w:bookmarkStart w:id="48" w:name="X90107c6aebb830e70e227f75b90402dd4fd542c"/>
+    <w:bookmarkEnd w:id="48"/>
+    <w:bookmarkStart w:id="49" w:name="X90107c6aebb830e70e227f75b90402dd4fd542c"/>
     <w:p>
       <w:pPr>
         <w:pStyle w:val="Heading1"/>
@@ -4209,8 +5020,8 @@
         <w:t xml:space="preserve">statistical detectability, not drawn from evidence.</w:t>
       </w:r>
     </w:p>
-    <w:bookmarkEnd w:id="48"/>
-    <w:bookmarkStart w:id="51" w:name="open-questions"/>
+    <w:bookmarkEnd w:id="49"/>
+    <w:bookmarkStart w:id="52" w:name="open-questions"/>
     <w:p>
       <w:pPr>
         <w:pStyle w:val="Heading1"/>
@@ -4219,7 +5030,7 @@
         <w:t xml:space="preserve">Open questions</w:t>
       </w:r>
     </w:p>
-    <w:bookmarkStart w:id="49" w:name="for-arijit"/>
+    <w:bookmarkStart w:id="50" w:name="for-arijit"/>
     <w:p>
       <w:pPr>
         <w:pStyle w:val="Heading2"/>
@@ -4379,8 +5190,8 @@
         <w:t xml:space="preserve">this goes to CIHR?</w:t>
       </w:r>
     </w:p>
-    <w:bookmarkEnd w:id="49"/>
-    <w:bookmarkStart w:id="50" w:name="for-cihrs-funding-analytics-team"/>
+    <w:bookmarkEnd w:id="50"/>
+    <w:bookmarkStart w:id="51" w:name="for-cihrs-funding-analytics-team"/>
     <w:p>
       <w:pPr>
         <w:pStyle w:val="Heading2"/>
@@ -4583,9 +5394,9 @@
         <w:t xml:space="preserve">Discussion time? Do we know how long the discussion period goes at the application level?</w:t>
       </w:r>
     </w:p>
-    <w:bookmarkEnd w:id="50"/>
     <w:bookmarkEnd w:id="51"/>
-    <w:bookmarkStart w:id="52" w:name="what-comes-next"/>
+    <w:bookmarkEnd w:id="52"/>
+    <w:bookmarkStart w:id="53" w:name="what-comes-next"/>
     <w:p>
       <w:pPr>
         <w:pStyle w:val="Heading1"/>
@@ -4680,8 +5491,8 @@
         <w:t xml:space="preserve">frequentist checks above do at a point-estimate level.</w:t>
       </w:r>
     </w:p>
-    <w:bookmarkEnd w:id="52"/>
-    <w:bookmarkStart w:id="54" w:name="references"/>
+    <w:bookmarkEnd w:id="53"/>
+    <w:bookmarkStart w:id="55" w:name="references"/>
     <w:p>
       <w:pPr>
         <w:pStyle w:val="Heading1"/>
@@ -4690,9 +5501,9 @@
         <w:t xml:space="preserve">References</w:t>
       </w:r>
     </w:p>
-    <w:bookmarkStart w:id="53" w:name="refs"/>
-    <w:bookmarkEnd w:id="53"/>
+    <w:bookmarkStart w:id="54" w:name="refs"/>
     <w:bookmarkEnd w:id="54"/>
+    <w:bookmarkEnd w:id="55"/>
     <w:sectPr>
       <w:footnotePr>
         <w:numRestart w:val="eachSect"/>

</xml_diff>

<commit_message>
Add graphs of magnitude model
</commit_message>
<xml_diff>
--- a/writing/ror-modeling-strategy.docx
+++ b/writing/ror-modeling-strategy.docx
@@ -1703,7 +1703,7 @@
       </m:oMathPara>
     </w:p>
     <w:bookmarkEnd w:id="26"/>
-    <w:bookmarkStart w:id="61" w:name="model-specification-aim-1"/>
+    <w:bookmarkStart w:id="66" w:name="model-specification-aim-1"/>
     <w:p>
       <w:pPr>
         <w:pStyle w:val="Heading1"/>
@@ -2046,13 +2046,13 @@
         </w:tc>
       </w:tr>
     </w:tbl>
-    <w:bookmarkStart w:id="34" w:name="simulating-the-data-generating-process"/>
+    <w:bookmarkStart w:id="34" w:name="X31aea19bb4e95a35941cf641fb9027072c8d7a9"/>
     <w:p>
       <w:pPr>
         <w:pStyle w:val="Heading2"/>
       </w:pPr>
       <w:r>
-        <w:t xml:space="preserve">Simulating the data-generating process</w:t>
+        <w:t xml:space="preserve">Model specification: magnitude, given a deviation</w:t>
       </w:r>
     </w:p>
     <w:p>
@@ -2060,19 +2060,372 @@
         <w:pStyle w:val="FirstParagraph"/>
       </w:pPr>
       <w:r>
-        <w:t xml:space="preserve">For the basic structure of the data generating process we use 50 committees, 15 discussed applications per committee, 24 members per committee. We also simulate another 15 applications that will end up being streamlined. For the assignments we have 3 of the 24 members on each application as the assigned reviewers, the rest are non-reviewing panelists. A consensus score is drawn per application (committee- and application-level random effects only, no member-level variation yet, since this is before any individual scoring happens). Whether each member deviates from that consensus is a function of their role and self-described expertise; if they deviate, the signed magnitude is drawn from a truncated distribution and rounded to the nearest tenth, matching CIHR’s one-decimal-place scoring (with rejection sampling so a</w:t>
-      </w:r>
-      <w:r>
-        <w:t xml:space="preserve"> </w:t>
-      </w:r>
-      <w:r>
-        <w:t xml:space="preserve">“deviated”</w:t>
-      </w:r>
-      <w:r>
-        <w:t xml:space="preserve"> </w:t>
-      </w:r>
-      <w:r>
-        <w:t xml:space="preserve">row can never round down to a contradictory zero).</w:t>
+        <w:t xml:space="preserve">The second part of the model asks, among members who deviated, how large a deviation (</w:t>
+      </w:r>
+      <m:oMath>
+        <m:sSub>
+          <m:e>
+            <m:r>
+              <m:t>M</m:t>
+            </m:r>
+          </m:e>
+          <m:sub>
+            <m:r>
+              <m:t>i</m:t>
+            </m:r>
+            <m:r>
+              <m:t>j</m:t>
+            </m:r>
+            <m:r>
+              <m:t>k</m:t>
+            </m:r>
+          </m:sub>
+        </m:sSub>
+      </m:oMath>
+      <w:r>
+        <w:t xml:space="preserve">, one of 10 discrete steps</w:t>
+      </w:r>
+      <w:r>
+        <w:t xml:space="preserve"> </w:t>
+      </w:r>
+      <m:oMath>
+        <m:r>
+          <m:rPr>
+            <m:sty m:val="p"/>
+          </m:rPr>
+          <m:t>±</m:t>
+        </m:r>
+        <m:r>
+          <m:t>0.1</m:t>
+        </m:r>
+        <m:r>
+          <m:rPr>
+            <m:sty m:val="p"/>
+          </m:rPr>
+          <m:t>…</m:t>
+        </m:r>
+        <m:r>
+          <m:rPr>
+            <m:sty m:val="p"/>
+          </m:rPr>
+          <m:t>±</m:t>
+        </m:r>
+        <m:r>
+          <m:t>0.5</m:t>
+        </m:r>
+      </m:oMath>
+      <w:r>
+        <w:t xml:space="preserve">)? We use an ordinal cumulative-logit model with flexible (non-equidistant) thresholds</w:t>
+      </w:r>
+      <w:r>
+        <w:t xml:space="preserve"> </w:t>
+      </w:r>
+      <m:oMath>
+        <m:sSub>
+          <m:e>
+            <m:r>
+              <m:t>τ</m:t>
+            </m:r>
+          </m:e>
+          <m:sub>
+            <m:r>
+              <m:t>c</m:t>
+            </m:r>
+          </m:sub>
+        </m:sSub>
+      </m:oMath>
+      <w:r>
+        <w:t xml:space="preserve">. One difference from Part 1 is worth flagging: because the</w:t>
+      </w:r>
+      <w:r>
+        <w:t xml:space="preserve"> </w:t>
+      </w:r>
+      <m:oMath>
+        <m:r>
+          <m:t>K</m:t>
+        </m:r>
+        <m:r>
+          <m:rPr>
+            <m:sty m:val="p"/>
+          </m:rPr>
+          <m:t>−</m:t>
+        </m:r>
+        <m:r>
+          <m:t>1</m:t>
+        </m:r>
+        <m:r>
+          <m:rPr>
+            <m:sty m:val="p"/>
+          </m:rPr>
+          <m:t>=</m:t>
+        </m:r>
+        <m:r>
+          <m:t>9</m:t>
+        </m:r>
+      </m:oMath>
+      <w:r>
+        <w:t xml:space="preserve"> </w:t>
+      </w:r>
+      <w:r>
+        <w:t xml:space="preserve">thresholds already anchor the model’s location, none of the group-level intercepts needs to absorb a population mean the way</w:t>
+      </w:r>
+      <w:r>
+        <w:t xml:space="preserve"> </w:t>
+      </w:r>
+      <m:oMath>
+        <m:sSub>
+          <m:e>
+            <m:r>
+              <m:t>α</m:t>
+            </m:r>
+          </m:e>
+          <m:sub>
+            <m:r>
+              <m:t>m</m:t>
+            </m:r>
+            <m:r>
+              <m:t>e</m:t>
+            </m:r>
+            <m:r>
+              <m:t>m</m:t>
+            </m:r>
+            <m:d>
+              <m:dPr>
+                <m:begChr m:val="["/>
+                <m:sepChr m:val=""/>
+                <m:endChr m:val="]"/>
+                <m:grow/>
+              </m:dPr>
+              <m:e>
+                <m:r>
+                  <m:t>i</m:t>
+                </m:r>
+              </m:e>
+            </m:d>
+          </m:sub>
+        </m:sSub>
+      </m:oMath>
+      <w:r>
+        <w:t xml:space="preserve"> </w:t>
+      </w:r>
+      <w:r>
+        <w:t xml:space="preserve">did above –</w:t>
+      </w:r>
+      <w:r>
+        <w:t xml:space="preserve"> </w:t>
+      </w:r>
+      <m:oMath>
+        <m:sSub>
+          <m:e>
+            <m:r>
+              <m:t>γ</m:t>
+            </m:r>
+          </m:e>
+          <m:sub>
+            <m:r>
+              <m:t>c</m:t>
+            </m:r>
+            <m:r>
+              <m:t>m</m:t>
+            </m:r>
+            <m:r>
+              <m:t>t</m:t>
+            </m:r>
+            <m:r>
+              <m:t>e</m:t>
+            </m:r>
+            <m:d>
+              <m:dPr>
+                <m:begChr m:val="["/>
+                <m:sepChr m:val=""/>
+                <m:endChr m:val="]"/>
+                <m:grow/>
+              </m:dPr>
+              <m:e>
+                <m:r>
+                  <m:t>k</m:t>
+                </m:r>
+              </m:e>
+            </m:d>
+          </m:sub>
+        </m:sSub>
+      </m:oMath>
+      <w:r>
+        <w:t xml:space="preserve">,</w:t>
+      </w:r>
+      <w:r>
+        <w:t xml:space="preserve"> </w:t>
+      </w:r>
+      <m:oMath>
+        <m:sSub>
+          <m:e>
+            <m:r>
+              <m:t>α</m:t>
+            </m:r>
+          </m:e>
+          <m:sub>
+            <m:r>
+              <m:t>m</m:t>
+            </m:r>
+            <m:r>
+              <m:t>e</m:t>
+            </m:r>
+            <m:r>
+              <m:t>m</m:t>
+            </m:r>
+            <m:d>
+              <m:dPr>
+                <m:begChr m:val="["/>
+                <m:sepChr m:val=""/>
+                <m:endChr m:val="]"/>
+                <m:grow/>
+              </m:dPr>
+              <m:e>
+                <m:r>
+                  <m:t>i</m:t>
+                </m:r>
+              </m:e>
+            </m:d>
+          </m:sub>
+        </m:sSub>
+      </m:oMath>
+      <w:r>
+        <w:t xml:space="preserve">, and</w:t>
+      </w:r>
+      <w:r>
+        <w:t xml:space="preserve"> </w:t>
+      </w:r>
+      <m:oMath>
+        <m:sSub>
+          <m:e>
+            <m:r>
+              <m:t>β</m:t>
+            </m:r>
+          </m:e>
+          <m:sub>
+            <m:r>
+              <m:t>a</m:t>
+            </m:r>
+            <m:r>
+              <m:t>p</m:t>
+            </m:r>
+            <m:r>
+              <m:t>p</m:t>
+            </m:r>
+            <m:d>
+              <m:dPr>
+                <m:begChr m:val="["/>
+                <m:sepChr m:val=""/>
+                <m:endChr m:val="]"/>
+                <m:grow/>
+              </m:dPr>
+              <m:e>
+                <m:r>
+                  <m:t>j</m:t>
+                </m:r>
+              </m:e>
+            </m:d>
+          </m:sub>
+        </m:sSub>
+      </m:oMath>
+      <w:r>
+        <w:t xml:space="preserve"> </w:t>
+      </w:r>
+      <w:r>
+        <w:t xml:space="preserve">are all mean-zero here. The other difference is new as of this round of simulation work: role (reviewer vs. panelist) doesn’t just shift</w:t>
+      </w:r>
+      <w:r>
+        <w:t xml:space="preserve"> </w:t>
+      </w:r>
+      <w:r>
+        <w:rPr>
+          <w:i/>
+          <w:iCs/>
+        </w:rPr>
+        <w:t xml:space="preserve">where</w:t>
+      </w:r>
+      <w:r>
+        <w:t xml:space="preserve"> </w:t>
+      </w:r>
+      <w:r>
+        <w:t xml:space="preserve">a member’s deviation tends to land (</w:t>
+      </w:r>
+      <m:oMath>
+        <m:sSub>
+          <m:e>
+            <m:r>
+              <m:t>η</m:t>
+            </m:r>
+          </m:e>
+          <m:sub>
+            <m:r>
+              <m:t>i</m:t>
+            </m:r>
+            <m:r>
+              <m:t>j</m:t>
+            </m:r>
+            <m:r>
+              <m:t>k</m:t>
+            </m:r>
+          </m:sub>
+        </m:sSub>
+      </m:oMath>
+      <w:r>
+        <w:t xml:space="preserve">), it also affects</w:t>
+      </w:r>
+      <w:r>
+        <w:t xml:space="preserve"> </w:t>
+      </w:r>
+      <w:r>
+        <w:rPr>
+          <w:i/>
+          <w:iCs/>
+        </w:rPr>
+        <w:t xml:space="preserve">how spread out</w:t>
+      </w:r>
+      <w:r>
+        <w:t xml:space="preserve"> </w:t>
+      </w:r>
+      <w:r>
+        <w:t xml:space="preserve">the deviation is (</w:t>
+      </w:r>
+      <m:oMath>
+        <m:sSub>
+          <m:e>
+            <m:r>
+              <m:t>κ</m:t>
+            </m:r>
+          </m:e>
+          <m:sub>
+            <m:r>
+              <m:t>i</m:t>
+            </m:r>
+            <m:r>
+              <m:t>j</m:t>
+            </m:r>
+            <m:r>
+              <m:t>k</m:t>
+            </m:r>
+          </m:sub>
+        </m:sSub>
+      </m:oMath>
+      <w:r>
+        <w:t xml:space="preserve">, brms’s discrimination parameter for ordinal models) – panelists show a genuinely wider distribution of deviation sizes, not just a different average.</w:t>
+      </w:r>
+      <w:r>
+        <w:t xml:space="preserve"> </w:t>
+      </w:r>
+      <w:r>
+        <w:rPr>
+          <w:rStyle w:val="VerbatimChar"/>
+        </w:rPr>
+        <w:t xml:space="preserve">disc ~ 0 + job</w:t>
+      </w:r>
+      <w:r>
+        <w:t xml:space="preserve"> </w:t>
+      </w:r>
+      <w:r>
+        <w:t xml:space="preserve">estimates that discrimination directly for each role rather than as a contrast against a reference level.</w:t>
       </w:r>
     </w:p>
     <w:p>
@@ -2080,11 +2433,278 @@
         <w:pStyle w:val="BodyText"/>
       </w:pPr>
       <w:r>
-        <w:t xml:space="preserve">Every parameter above is at this point just an educated guess and a placeholder, since the point of the simulation is to see whether our modeling approach recovers a known effects, not predictive of what CIHR’s actual numbers will look like.</w:t>
+        <w:rPr>
+          <w:b/>
+          <w:bCs/>
+        </w:rPr>
+        <w:t xml:space="preserve">Why ordinal (</w:t>
+      </w:r>
+      <w:r>
+        <w:rPr>
+          <w:rStyle w:val="VerbatimChar"/>
+          <w:b/>
+          <w:bCs/>
+        </w:rPr>
+        <w:t xml:space="preserve">cumulative()</w:t>
+      </w:r>
+      <w:r>
+        <w:rPr>
+          <w:b/>
+          <w:bCs/>
+        </w:rPr>
+        <w:t xml:space="preserve">), not categorical/multinomial?</w:t>
+      </w:r>
+      <w:r>
+        <w:t xml:space="preserve"> </w:t>
+      </w:r>
+      <w:r>
+        <w:t xml:space="preserve">The 10 magnitude levels aren’t just index labels – they’re the literal numeric ordering of</w:t>
+      </w:r>
+      <w:r>
+        <w:t xml:space="preserve"> </w:t>
+      </w:r>
+      <w:r>
+        <w:rPr>
+          <w:rStyle w:val="VerbatimChar"/>
+        </w:rPr>
+        <w:t xml:space="preserve">final_score - consensus</w:t>
+      </w:r>
+      <w:r>
+        <w:t xml:space="preserve"> </w:t>
+      </w:r>
+      <w:r>
+        <w:t xml:space="preserve">(</w:t>
+      </w:r>
+      <m:oMath>
+        <m:r>
+          <m:rPr>
+            <m:sty m:val="p"/>
+          </m:rPr>
+          <m:t>−</m:t>
+        </m:r>
+        <m:r>
+          <m:t>0.5</m:t>
+        </m:r>
+        <m:r>
+          <m:rPr>
+            <m:sty m:val="p"/>
+          </m:rPr>
+          <m:t>&lt;</m:t>
+        </m:r>
+        <m:r>
+          <m:rPr>
+            <m:sty m:val="p"/>
+          </m:rPr>
+          <m:t>−</m:t>
+        </m:r>
+        <m:r>
+          <m:t>0.4</m:t>
+        </m:r>
+        <m:r>
+          <m:rPr>
+            <m:sty m:val="p"/>
+          </m:rPr>
+          <m:t>&lt;</m:t>
+        </m:r>
+        <m:r>
+          <m:rPr>
+            <m:sty m:val="p"/>
+          </m:rPr>
+          <m:t>…</m:t>
+        </m:r>
+        <m:r>
+          <m:rPr>
+            <m:sty m:val="p"/>
+          </m:rPr>
+          <m:t>&lt;</m:t>
+        </m:r>
+        <m:r>
+          <m:rPr>
+            <m:sty m:val="p"/>
+          </m:rPr>
+          <m:t>−</m:t>
+        </m:r>
+        <m:r>
+          <m:t>0.1</m:t>
+        </m:r>
+        <m:r>
+          <m:rPr>
+            <m:sty m:val="p"/>
+          </m:rPr>
+          <m:t>&lt;</m:t>
+        </m:r>
+        <m:r>
+          <m:t>0.1</m:t>
+        </m:r>
+        <m:r>
+          <m:rPr>
+            <m:sty m:val="p"/>
+          </m:rPr>
+          <m:t>&lt;</m:t>
+        </m:r>
+        <m:r>
+          <m:rPr>
+            <m:sty m:val="p"/>
+          </m:rPr>
+          <m:t>…</m:t>
+        </m:r>
+        <m:r>
+          <m:rPr>
+            <m:sty m:val="p"/>
+          </m:rPr>
+          <m:t>&lt;</m:t>
+        </m:r>
+        <m:r>
+          <m:t>0.5</m:t>
+        </m:r>
+      </m:oMath>
+      <w:r>
+        <w:t xml:space="preserve">), and treating them as categorical would throw that structure away, treating</w:t>
+      </w:r>
+      <w:r>
+        <w:t xml:space="preserve"> </w:t>
+      </w:r>
+      <w:r>
+        <w:t xml:space="preserve">“+0.3”</w:t>
+      </w:r>
+      <w:r>
+        <w:t xml:space="preserve"> </w:t>
+      </w:r>
+      <w:r>
+        <w:t xml:space="preserve">and</w:t>
+      </w:r>
+      <w:r>
+        <w:t xml:space="preserve"> </w:t>
+      </w:r>
+      <w:r>
+        <w:t xml:space="preserve">“-0.4”</w:t>
+      </w:r>
+      <w:r>
+        <w:t xml:space="preserve"> </w:t>
+      </w:r>
+      <w:r>
+        <w:t xml:space="preserve">as no more related to each other than either is to</w:t>
+      </w:r>
+      <w:r>
+        <w:t xml:space="preserve"> </w:t>
+      </w:r>
+      <w:r>
+        <w:t xml:space="preserve">“+0.1”</w:t>
+      </w:r>
+      <w:r>
+        <w:t xml:space="preserve">. It also matches the actual data-generating mechanism: this is a continuous quantity (a truncated-normal draw) rounded to one decimal place for recording, not 10 qualitatively distinct outcomes – modeling a discretized continuum with an ordinal model, rather than as unordered categories, is the standard match for that kind of measurement. A multinomial model would also need a full separate set of coefficients (role, expertise, every random effect) for each of the 9 non-reference categories – roughly 9x the parameters of the ordinal specification, most poorly identified given how sparse the tail categories are – versus the ordinal model’s single location parameter (and now, a role-specific dispersion parameter) shared across all 10 categories via the threshold structure. That matters substantively too: our actual hypotheses (</w:t>
+      </w:r>
+      <w:r>
+        <w:t xml:space="preserve">“panelists’ deviations run larger on average,”</w:t>
+      </w:r>
+      <w:r>
+        <w:t xml:space="preserve"> </w:t>
+      </w:r>
+      <w:r>
+        <w:t xml:space="preserve">“panelists show more spread”</w:t>
+      </w:r>
+      <w:r>
+        <w:t xml:space="preserve">) are inherently location/dispersion statements, which only have a natural expression on an ordered scale – a categorical model has no notion of shift or spread at all, just 10 free-floating probabilities from which those would have to be reconstructed post hoc.</w:t>
+      </w:r>
+    </w:p>
+    <w:p>
+      <w:pPr>
+        <w:pStyle w:val="BodyText"/>
+      </w:pPr>
+      <w:r>
+        <w:t xml:space="preserve">One caveat worth flagging: treating the</w:t>
+      </w:r>
+      <w:r>
+        <w:t xml:space="preserve"> </w:t>
+      </w:r>
+      <w:r>
+        <w:rPr>
+          <w:i/>
+          <w:iCs/>
+        </w:rPr>
+        <w:t xml:space="preserve">full signed</w:t>
+      </w:r>
+      <w:r>
+        <w:t xml:space="preserve"> </w:t>
+      </w:r>
+      <w:r>
+        <w:t xml:space="preserve">scale as a single ordered dimension is a modeling choice, not the only defensible one. It implicitly assumes direction and magnitude of deviation share one underlying continuum, rather than direction being a separate, qualitatively distinct decision (up vs. down) with magnitude nested inside it – the latter is what the alternative three-part model discussed elsewhere (bernoulli direction + ordinal</w:t>
+      </w:r>
+      <w:r>
+        <w:t xml:space="preserve"> </w:t>
+      </w:r>
+      <m:oMath>
+        <m:d>
+          <m:dPr>
+            <m:begChr m:val="|"/>
+            <m:sepChr m:val=""/>
+            <m:endChr m:val="|"/>
+            <m:grow/>
+          </m:dPr>
+          <m:e>
+            <m:r>
+              <m:rPr>
+                <m:nor/>
+                <m:sty m:val="p"/>
+              </m:rPr>
+              <m:t>magnitude</m:t>
+            </m:r>
+          </m:e>
+        </m:d>
+      </m:oMath>
+      <w:r>
+        <w:t xml:space="preserve">) would assume instead. We think the single-continuum assumption is the more faithful match to how these scores actually arise (one continuous departure from consensus, not</w:t>
+      </w:r>
+      <w:r>
+        <w:t xml:space="preserve"> </w:t>
+      </w:r>
+      <w:r>
+        <w:t xml:space="preserve">“decide direction, then decide how far”</w:t>
+      </w:r>
+      <w:r>
+        <w:t xml:space="preserve">), but it is an assumption.</w:t>
       </w:r>
     </w:p>
     <w:bookmarkEnd w:id="34"/>
-    <w:bookmarkStart w:id="51" w:name="simulated-data"/>
+    <w:bookmarkStart w:id="35" w:name="simulating-the-data-generating-process"/>
+    <w:p>
+      <w:pPr>
+        <w:pStyle w:val="Heading2"/>
+      </w:pPr>
+      <w:r>
+        <w:t xml:space="preserve">Simulating the data-generating process</w:t>
+      </w:r>
+    </w:p>
+    <w:p>
+      <w:pPr>
+        <w:pStyle w:val="FirstParagraph"/>
+      </w:pPr>
+      <w:r>
+        <w:t xml:space="preserve">For the basic structure of the data generating process we use 50 committees, 15 discussed applications per committee, 24 members per committee. We also simulate another 15 applications that will end up being streamlined. For the assignments we have 3 of the 24 members on each application as the assigned reviewers, the rest are non-reviewing panelists. A consensus score is drawn per application (committee- and application-level random effects only, no member-level variation yet, since this is before any individual scoring happens). Whether each member deviates from that consensus is a function of their role and self-described expertise; if they deviate, the signed magnitude is drawn from a truncated distribution and rounded to the nearest tenth, matching CIHR’s one-decimal-place scoring (with rejection sampling so a</w:t>
+      </w:r>
+      <w:r>
+        <w:t xml:space="preserve"> </w:t>
+      </w:r>
+      <w:r>
+        <w:t xml:space="preserve">“deviated”</w:t>
+      </w:r>
+      <w:r>
+        <w:t xml:space="preserve"> </w:t>
+      </w:r>
+      <w:r>
+        <w:t xml:space="preserve">row can never round down to a contradictory zero).</w:t>
+      </w:r>
+    </w:p>
+    <w:p>
+      <w:pPr>
+        <w:pStyle w:val="BodyText"/>
+      </w:pPr>
+      <w:r>
+        <w:t xml:space="preserve">Every parameter above is at this point just an educated guess and a placeholder, since the point of the simulation is to see whether our modeling approach recovers a known effects, not predictive of what CIHR’s actual numbers will look like.</w:t>
+      </w:r>
+    </w:p>
+    <w:bookmarkEnd w:id="35"/>
+    <w:bookmarkStart w:id="52" w:name="simulated-data"/>
     <w:p>
       <w:pPr>
         <w:pStyle w:val="Heading2"/>
@@ -2131,7 +2751,7 @@
       <w:tr>
         <w:tc>
           <w:tcPr/>
-          <w:bookmarkStart w:id="38" w:name="fig-cmte"/>
+          <w:bookmarkStart w:id="39" w:name="fig-cmte"/>
           <w:p>
             <w:pPr>
               <w:pStyle w:val="Compact"/>
@@ -2142,18 +2762,18 @@
                 <wp:inline>
                   <wp:extent cx="5334000" cy="4267200"/>
                   <wp:effectExtent b="0" l="0" r="0" t="0"/>
-                  <wp:docPr descr="" title="" id="36" name="Picture"/>
+                  <wp:docPr descr="" title="" id="37" name="Picture"/>
                   <a:graphic>
                     <a:graphicData uri="http://schemas.openxmlformats.org/drawingml/2006/picture">
                       <pic:pic>
                         <pic:nvPicPr>
-                          <pic:cNvPr descr="ror-modeling-strategy_files/figure-docx/fig-cmte-1.png" id="37" name="Picture"/>
+                          <pic:cNvPr descr="ror-modeling-strategy_files/figure-docx/fig-cmte-1.png" id="38" name="Picture"/>
                           <pic:cNvPicPr>
                             <a:picLocks noChangeArrowheads="1" noChangeAspect="1"/>
                           </pic:cNvPicPr>
                         </pic:nvPicPr>
                         <pic:blipFill>
-                          <a:blip r:embed="rId35"/>
+                          <a:blip r:embed="rId36"/>
                           <a:stretch>
                             <a:fillRect/>
                           </a:stretch>
@@ -2193,7 +2813,7 @@
               <w:t xml:space="preserve">Figure 2: Distribution of committee sizes, total and discussed applications</w:t>
             </w:r>
           </w:p>
-          <w:bookmarkEnd w:id="38"/>
+          <w:bookmarkEnd w:id="39"/>
         </w:tc>
       </w:tr>
     </w:tbl>
@@ -2245,7 +2865,7 @@
       <w:tr>
         <w:tc>
           <w:tcPr/>
-          <w:bookmarkStart w:id="42" w:name="fig-scores"/>
+          <w:bookmarkStart w:id="43" w:name="fig-scores"/>
           <w:p>
             <w:pPr>
               <w:pStyle w:val="Compact"/>
@@ -2256,18 +2876,18 @@
                 <wp:inline>
                   <wp:extent cx="5334000" cy="4267200"/>
                   <wp:effectExtent b="0" l="0" r="0" t="0"/>
-                  <wp:docPr descr="" title="" id="40" name="Picture"/>
+                  <wp:docPr descr="" title="" id="41" name="Picture"/>
                   <a:graphic>
                     <a:graphicData uri="http://schemas.openxmlformats.org/drawingml/2006/picture">
                       <pic:pic>
                         <pic:nvPicPr>
-                          <pic:cNvPr descr="ror-modeling-strategy_files/figure-docx/fig-scores-1.png" id="41" name="Picture"/>
+                          <pic:cNvPr descr="ror-modeling-strategy_files/figure-docx/fig-scores-1.png" id="42" name="Picture"/>
                           <pic:cNvPicPr>
                             <a:picLocks noChangeArrowheads="1" noChangeAspect="1"/>
                           </pic:cNvPicPr>
                         </pic:nvPicPr>
                         <pic:blipFill>
-                          <a:blip r:embed="rId39"/>
+                          <a:blip r:embed="rId40"/>
                           <a:stretch>
                             <a:fillRect/>
                           </a:stretch>
@@ -2307,7 +2927,7 @@
               <w:t xml:space="preserve">Figure 3: Distribution of simulated intial, consensus, and overall scores</w:t>
             </w:r>
           </w:p>
-          <w:bookmarkEnd w:id="42"/>
+          <w:bookmarkEnd w:id="43"/>
         </w:tc>
       </w:tr>
     </w:tbl>
@@ -2343,7 +2963,7 @@
       <w:tr>
         <w:tc>
           <w:tcPr/>
-          <w:bookmarkStart w:id="46" w:name="fig-dev"/>
+          <w:bookmarkStart w:id="47" w:name="fig-dev"/>
           <w:p>
             <w:pPr>
               <w:pStyle w:val="Compact"/>
@@ -2354,18 +2974,18 @@
                 <wp:inline>
                   <wp:extent cx="5334000" cy="4267200"/>
                   <wp:effectExtent b="0" l="0" r="0" t="0"/>
-                  <wp:docPr descr="" title="" id="44" name="Picture"/>
+                  <wp:docPr descr="" title="" id="45" name="Picture"/>
                   <a:graphic>
                     <a:graphicData uri="http://schemas.openxmlformats.org/drawingml/2006/picture">
                       <pic:pic>
                         <pic:nvPicPr>
-                          <pic:cNvPr descr="ror-modeling-strategy_files/figure-docx/fig-dev-1.png" id="45" name="Picture"/>
+                          <pic:cNvPr descr="ror-modeling-strategy_files/figure-docx/fig-dev-1.png" id="46" name="Picture"/>
                           <pic:cNvPicPr>
                             <a:picLocks noChangeArrowheads="1" noChangeAspect="1"/>
                           </pic:cNvPicPr>
                         </pic:nvPicPr>
                         <pic:blipFill>
-                          <a:blip r:embed="rId43"/>
+                          <a:blip r:embed="rId44"/>
                           <a:stretch>
                             <a:fillRect/>
                           </a:stretch>
@@ -2405,7 +3025,7 @@
               <w:t xml:space="preserve">Figure 4: Distribution of deviations from overall consensus scores</w:t>
             </w:r>
           </w:p>
-          <w:bookmarkEnd w:id="46"/>
+          <w:bookmarkEnd w:id="47"/>
         </w:tc>
       </w:tr>
     </w:tbl>
@@ -2441,7 +3061,7 @@
       <w:tr>
         <w:tc>
           <w:tcPr/>
-          <w:bookmarkStart w:id="50" w:name="fig-var"/>
+          <w:bookmarkStart w:id="51" w:name="fig-var"/>
           <w:p>
             <w:pPr>
               <w:pStyle w:val="Compact"/>
@@ -2452,18 +3072,18 @@
                 <wp:inline>
                   <wp:extent cx="5334000" cy="4267200"/>
                   <wp:effectExtent b="0" l="0" r="0" t="0"/>
-                  <wp:docPr descr="" title="" id="48" name="Picture"/>
+                  <wp:docPr descr="" title="" id="49" name="Picture"/>
                   <a:graphic>
                     <a:graphicData uri="http://schemas.openxmlformats.org/drawingml/2006/picture">
                       <pic:pic>
                         <pic:nvPicPr>
-                          <pic:cNvPr descr="ror-modeling-strategy_files/figure-docx/fig-var-1.png" id="49" name="Picture"/>
+                          <pic:cNvPr descr="ror-modeling-strategy_files/figure-docx/fig-var-1.png" id="50" name="Picture"/>
                           <pic:cNvPicPr>
                             <a:picLocks noChangeArrowheads="1" noChangeAspect="1"/>
                           </pic:cNvPicPr>
                         </pic:nvPicPr>
                         <pic:blipFill>
-                          <a:blip r:embed="rId47"/>
+                          <a:blip r:embed="rId48"/>
                           <a:stretch>
                             <a:fillRect/>
                           </a:stretch>
@@ -2503,12 +3123,12 @@
               <w:t xml:space="preserve">Figure 5: Distribution of score variation by committee and application</w:t>
             </w:r>
           </w:p>
-          <w:bookmarkEnd w:id="50"/>
+          <w:bookmarkEnd w:id="51"/>
         </w:tc>
       </w:tr>
     </w:tbl>
-    <w:bookmarkEnd w:id="51"/>
-    <w:bookmarkStart w:id="54" w:name="part-1-did-this-member-deviate"/>
+    <w:bookmarkEnd w:id="52"/>
+    <w:bookmarkStart w:id="55" w:name="part-1-did-this-member-deviate"/>
     <w:p>
       <w:pPr>
         <w:pStyle w:val="Heading2"/>
@@ -2647,7 +3267,7 @@
       <w:tr>
         <w:tc>
           <w:tcPr/>
-          <w:bookmarkStart w:id="52" w:name="tbl-m1-deviate"/>
+          <w:bookmarkStart w:id="53" w:name="tbl-m1-deviate"/>
           <w:p>
             <w:pPr>
               <w:jc w:val="center"/>
@@ -3382,7 +4002,7 @@
               <w:t xml:space="preserve">Estimates from deviation model</w:t>
             </w:r>
           </w:p>
-          <w:bookmarkEnd w:id="52"/>
+          <w:bookmarkEnd w:id="53"/>
         </w:tc>
       </w:tr>
     </w:tbl>
@@ -3510,7 +4130,7 @@
       <w:tr>
         <w:tc>
           <w:tcPr/>
-          <w:bookmarkStart w:id="53" w:name="tbl-dev-me"/>
+          <w:bookmarkStart w:id="54" w:name="tbl-dev-me"/>
           <w:p>
             <w:pPr>
               <w:jc w:val="center"/>
@@ -4009,7 +4629,7 @@
               <w:t xml:space="preserve">Marginal effects from deviation model</w:t>
             </w:r>
           </w:p>
-          <w:bookmarkEnd w:id="53"/>
+          <w:bookmarkEnd w:id="54"/>
         </w:tc>
       </w:tr>
     </w:tbl>
@@ -4032,8 +4652,8 @@
         <w:t xml:space="preserve">show that the overall fraction of members that deviate is around 38%. Reviewers are slightly less likely to deviate than non-reviewing panelists. With respect to expertise, those with high expertise are the least likely to deviate from the consensus (30%), whereas those with no . In practice we</w:t>
       </w:r>
     </w:p>
-    <w:bookmarkEnd w:id="54"/>
-    <w:bookmarkStart w:id="59" w:name="part-2-how-large-given-a-deviation"/>
+    <w:bookmarkEnd w:id="55"/>
+    <w:bookmarkStart w:id="64" w:name="part-2-how-large-given-a-deviation"/>
     <w:p>
       <w:pPr>
         <w:pStyle w:val="Heading2"/>
@@ -4408,7 +5028,7 @@
         <w:pStyle w:val="BodyText"/>
       </w:pPr>
       <w:r>
-        <w:t xml:space="preserve">Below you can see the average marginal predictions for reviewers vs. panelists in terms of deviations from the consensus score:</w:t>
+        <w:t xml:space="preserve">Below you can see the average marginal predictions for reviewers vs. panelists in terms of deviations from the consensus score, given that a deviation occurred:</w:t>
       </w:r>
     </w:p>
     <w:tbl>
@@ -4424,7 +5044,7 @@
       <w:tr>
         <w:tc>
           <w:tcPr/>
-          <w:bookmarkStart w:id="58" w:name="fig-m2-magnitude-job"/>
+          <w:bookmarkStart w:id="59" w:name="fig-m2-magnitude-job"/>
           <w:p>
             <w:pPr>
               <w:pStyle w:val="Compact"/>
@@ -4435,18 +5055,18 @@
                 <wp:inline>
                   <wp:extent cx="5334000" cy="4267200"/>
                   <wp:effectExtent b="0" l="0" r="0" t="0"/>
-                  <wp:docPr descr="" title="" id="56" name="Picture"/>
+                  <wp:docPr descr="" title="" id="57" name="Picture"/>
                   <a:graphic>
                     <a:graphicData uri="http://schemas.openxmlformats.org/drawingml/2006/picture">
                       <pic:pic>
                         <pic:nvPicPr>
-                          <pic:cNvPr descr="ror-modeling-strategy_files/figure-docx/fig-m2-magnitude-job-1.png" id="57" name="Picture"/>
+                          <pic:cNvPr descr="ror-modeling-strategy_files/figure-docx/fig-m2-magnitude-job-1.png" id="58" name="Picture"/>
                           <pic:cNvPicPr>
                             <a:picLocks noChangeArrowheads="1" noChangeAspect="1"/>
                           </pic:cNvPicPr>
                         </pic:nvPicPr>
                         <pic:blipFill>
-                          <a:blip r:embed="rId55"/>
+                          <a:blip r:embed="rId56"/>
                           <a:stretch>
                             <a:fillRect/>
                           </a:stretch>
@@ -4486,12 +5106,113 @@
               <w:t xml:space="preserve">Figure 6: Predicted magnitude of deviation, by role</w:t>
             </w:r>
           </w:p>
-          <w:bookmarkEnd w:id="58"/>
+          <w:bookmarkEnd w:id="59"/>
         </w:tc>
       </w:tr>
     </w:tbl>
-    <w:bookmarkEnd w:id="59"/>
-    <w:bookmarkStart w:id="60" w:name="software"/>
+    <w:p>
+      <w:pPr>
+        <w:pStyle w:val="BodyText"/>
+      </w:pPr>
+      <w:r>
+        <w:t xml:space="preserve">These differences in predicted probabilities for deviations of different magnitudes can also be expressed as marginal effects in</w:t>
+      </w:r>
+      <w:r>
+        <w:t xml:space="preserve"> </w:t>
+      </w:r>
+      <w:hyperlink w:anchor="fig-m2-diffs">
+        <w:r>
+          <w:rPr>
+            <w:rStyle w:val="Hyperlink"/>
+          </w:rPr>
+          <w:t xml:space="preserve">Figure 7</w:t>
+        </w:r>
+      </w:hyperlink>
+      <w:r>
+        <w:t xml:space="preserve">:</w:t>
+      </w:r>
+    </w:p>
+    <w:tbl>
+      <w:tblPr>
+        <w:tblStyle w:val="Table"/>
+        <w:tblW w:type="pct" w:w="5000"/>
+        <w:tblLayout w:type="fixed"/>
+        <w:tblLook w:firstRow="0" w:lastRow="0" w:firstColumn="0" w:lastColumn="0" w:noHBand="0" w:noVBand="0" w:val="0000"/>
+      </w:tblPr>
+      <w:tblGrid>
+        <w:gridCol w:w="7920"/>
+      </w:tblGrid>
+      <w:tr>
+        <w:tc>
+          <w:tcPr/>
+          <w:bookmarkStart w:id="63" w:name="fig-m2-diffs"/>
+          <w:p>
+            <w:pPr>
+              <w:pStyle w:val="Compact"/>
+              <w:jc w:val="center"/>
+            </w:pPr>
+            <w:r>
+              <w:drawing>
+                <wp:inline>
+                  <wp:extent cx="5334000" cy="4267200"/>
+                  <wp:effectExtent b="0" l="0" r="0" t="0"/>
+                  <wp:docPr descr="" title="" id="61" name="Picture"/>
+                  <a:graphic>
+                    <a:graphicData uri="http://schemas.openxmlformats.org/drawingml/2006/picture">
+                      <pic:pic>
+                        <pic:nvPicPr>
+                          <pic:cNvPr descr="ror-modeling-strategy_files/figure-docx/fig-m2-diffs-1.png" id="62" name="Picture"/>
+                          <pic:cNvPicPr>
+                            <a:picLocks noChangeArrowheads="1" noChangeAspect="1"/>
+                          </pic:cNvPicPr>
+                        </pic:nvPicPr>
+                        <pic:blipFill>
+                          <a:blip r:embed="rId60"/>
+                          <a:stretch>
+                            <a:fillRect/>
+                          </a:stretch>
+                        </pic:blipFill>
+                        <pic:spPr bwMode="auto">
+                          <a:xfrm>
+                            <a:off x="0" y="0"/>
+                            <a:ext cx="5334000" cy="4267200"/>
+                          </a:xfrm>
+                          <a:prstGeom prst="rect">
+                            <a:avLst/>
+                          </a:prstGeom>
+                          <a:noFill/>
+                          <a:ln w="9525">
+                            <a:noFill/>
+                            <a:headEnd/>
+                            <a:tailEnd/>
+                          </a:ln>
+                        </pic:spPr>
+                      </pic:pic>
+                    </a:graphicData>
+                  </a:graphic>
+                </wp:inline>
+              </w:drawing>
+            </w:r>
+          </w:p>
+          <w:p>
+            <w:pPr>
+              <w:jc w:val="center"/>
+            </w:pPr>
+            <w:pPr>
+              <w:jc w:val="left"/>
+              <w:spacing w:before="200"/>
+              <w:pStyle w:val="ImageCaption"/>
+            </w:pPr>
+            <w:r>
+              <w:t xml:space="preserve">Figure 7: Marginal effects of job on the magnitude of deviations</w:t>
+            </w:r>
+          </w:p>
+          <w:bookmarkEnd w:id="63"/>
+        </w:tc>
+      </w:tr>
+    </w:tbl>
+    <w:bookmarkEnd w:id="64"/>
+    <w:bookmarkStart w:id="65" w:name="software"/>
     <w:p>
       <w:pPr>
         <w:pStyle w:val="Heading2"/>
@@ -4586,9 +5307,9 @@
         <w:t xml:space="preserve">silently reused) whenever formula or data change.</w:t>
       </w:r>
     </w:p>
-    <w:bookmarkEnd w:id="60"/>
-    <w:bookmarkEnd w:id="61"/>
-    <w:bookmarkStart w:id="62" w:name="Xa4f644ee47bdf4bb1fb2a41d5776bf65cc4489c"/>
+    <w:bookmarkEnd w:id="65"/>
+    <w:bookmarkEnd w:id="66"/>
+    <w:bookmarkStart w:id="67" w:name="Xa4f644ee47bdf4bb1fb2a41d5776bf65cc4489c"/>
     <w:p>
       <w:pPr>
         <w:pStyle w:val="Heading1"/>
@@ -5305,8 +6026,8 @@
         <w:t xml:space="preserve">aren’t written yet.</w:t>
       </w:r>
     </w:p>
-    <w:bookmarkEnd w:id="62"/>
-    <w:bookmarkStart w:id="63" w:name="aim-3-not-yet-designed"/>
+    <w:bookmarkEnd w:id="67"/>
+    <w:bookmarkStart w:id="68" w:name="aim-3-not-yet-designed"/>
     <w:p>
       <w:pPr>
         <w:pStyle w:val="Heading1"/>
@@ -5454,8 +6175,8 @@
         <w:t xml:space="preserve">tight that clustering actually is.</w:t>
       </w:r>
     </w:p>
-    <w:bookmarkEnd w:id="63"/>
-    <w:bookmarkStart w:id="64" w:name="a-note-on-simulation-architecture"/>
+    <w:bookmarkEnd w:id="68"/>
+    <w:bookmarkStart w:id="69" w:name="a-note-on-simulation-architecture"/>
     <w:p>
       <w:pPr>
         <w:pStyle w:val="Heading1"/>
@@ -5529,8 +6250,8 @@
         <w:t xml:space="preserve">reason about in isolation.</w:t>
       </w:r>
     </w:p>
-    <w:bookmarkEnd w:id="64"/>
-    <w:bookmarkStart w:id="65" w:name="X90107c6aebb830e70e227f75b90402dd4fd542c"/>
+    <w:bookmarkEnd w:id="69"/>
+    <w:bookmarkStart w:id="70" w:name="X90107c6aebb830e70e227f75b90402dd4fd542c"/>
     <w:p>
       <w:pPr>
         <w:pStyle w:val="Heading1"/>
@@ -5625,8 +6346,8 @@
         <w:t xml:space="preserve">statistical detectability, not drawn from evidence.</w:t>
       </w:r>
     </w:p>
-    <w:bookmarkEnd w:id="65"/>
-    <w:bookmarkStart w:id="68" w:name="open-questions"/>
+    <w:bookmarkEnd w:id="70"/>
+    <w:bookmarkStart w:id="73" w:name="open-questions"/>
     <w:p>
       <w:pPr>
         <w:pStyle w:val="Heading1"/>
@@ -5635,7 +6356,7 @@
         <w:t xml:space="preserve">Open questions</w:t>
       </w:r>
     </w:p>
-    <w:bookmarkStart w:id="66" w:name="for-arijit"/>
+    <w:bookmarkStart w:id="71" w:name="for-arijit"/>
     <w:p>
       <w:pPr>
         <w:pStyle w:val="Heading2"/>
@@ -5795,8 +6516,8 @@
         <w:t xml:space="preserve">this goes to CIHR?</w:t>
       </w:r>
     </w:p>
-    <w:bookmarkEnd w:id="66"/>
-    <w:bookmarkStart w:id="67" w:name="for-cihrs-funding-analytics-team"/>
+    <w:bookmarkEnd w:id="71"/>
+    <w:bookmarkStart w:id="72" w:name="for-cihrs-funding-analytics-team"/>
     <w:p>
       <w:pPr>
         <w:pStyle w:val="Heading2"/>
@@ -5999,9 +6720,9 @@
         <w:t xml:space="preserve">Discussion time? Do we know how long the discussion period goes at the application level?</w:t>
       </w:r>
     </w:p>
-    <w:bookmarkEnd w:id="67"/>
-    <w:bookmarkEnd w:id="68"/>
-    <w:bookmarkStart w:id="69" w:name="what-comes-next"/>
+    <w:bookmarkEnd w:id="72"/>
+    <w:bookmarkEnd w:id="73"/>
+    <w:bookmarkStart w:id="74" w:name="what-comes-next"/>
     <w:p>
       <w:pPr>
         <w:pStyle w:val="Heading1"/>
@@ -6096,8 +6817,8 @@
         <w:t xml:space="preserve">frequentist checks above do at a point-estimate level.</w:t>
       </w:r>
     </w:p>
-    <w:bookmarkEnd w:id="69"/>
-    <w:bookmarkStart w:id="70" w:name="Xf9d18d54290cc2f98f24e66a95860938f5a574d"/>
+    <w:bookmarkEnd w:id="74"/>
+    <w:bookmarkStart w:id="75" w:name="Xf9d18d54290cc2f98f24e66a95860938f5a574d"/>
     <w:p>
       <w:pPr>
         <w:pStyle w:val="Heading1"/>
@@ -18834,8 +19555,8 @@
         <w:t xml:space="preserve">))</w:t>
       </w:r>
     </w:p>
-    <w:bookmarkEnd w:id="70"/>
-    <w:bookmarkStart w:id="72" w:name="references"/>
+    <w:bookmarkEnd w:id="75"/>
+    <w:bookmarkStart w:id="77" w:name="references"/>
     <w:p>
       <w:pPr>
         <w:pStyle w:val="Heading1"/>
@@ -18844,9 +19565,9 @@
         <w:t xml:space="preserve">References</w:t>
       </w:r>
     </w:p>
-    <w:bookmarkStart w:id="71" w:name="refs"/>
-    <w:bookmarkEnd w:id="71"/>
-    <w:bookmarkEnd w:id="72"/>
+    <w:bookmarkStart w:id="76" w:name="refs"/>
+    <w:bookmarkEnd w:id="76"/>
+    <w:bookmarkEnd w:id="77"/>
     <w:sectPr>
       <w:footnotePr>
         <w:numRestart w:val="eachSect"/>

</xml_diff>